<commit_message>
Attribute the R(a) substitution with a third arm on xl, section 2.3
</commit_message>
<xml_diff>
--- a/docx/【work2】胡宏彬-进度文档-20260821.docx
+++ b/docx/【work2】胡宏彬-进度文档-20260821.docx
@@ -5489,7 +5489,66 @@
         <w:rPr>
           <w:rFonts w:hint="eastAsia"/>
         </w:rPr>
-        <w:t>两者分别回答改善铺开了多少维度与这些维度改善了多少。只看铺开的宽度会把普遍而微弱的变化误判为有效，只看幅度则会让单一维度的塌陷主导判断，因此两者同时进入风险。一个标准差单位的中位改善已经是决定性的编辑，深度在该处饱和。三项都取自本次候选自身，与窗口的缺陷假设无关。用缺陷假设的后验充当风险曾是早期做法，实测显示它与编辑是否成功反向，后验最确信的十分之一窗口反而更容易收到错误编辑，因此改用上面的三项。上式定义在单个窗口上，而治理的最终对象是整个语料，两者通过下面的损害定义连接。</w:t>
+        <w:t xml:space="preserve">两者分别回答改善铺开了多少维度与这些维度改善了多少。只看铺开的宽度会把普遍而微弱的变化误判为有效，只看幅度则会让单一维度的塌陷主导判断，因此两者同时进入风险。一个标准差单位的中位改善已经是决定性的编辑，深度在该处饱和。三项都取自本次候选自身，与窗口的缺陷假设无关。用缺陷假设的后验充当风险曾是早期做法，实测显示它与编辑是否成功反向，按风险状态置信度排序，最确信十分之一编辑的错误率为 0.595，全体为 0.484，覆盖率取 0.25 与 0.50 与 0.75 三档时分别为 0.649 与 0.608 与 0.583，整条曲线走向与置信度相反，依据该信号做选择性执行只会使结果更差，因此改用上面的三项。</w:t>
+      </w:r>
+    </w:p>
+    <w:p>
+      <w:pPr>
+        <w:ind w:firstLineChars="200" w:firstLine="420"/>
+      </w:pPr>
+      <w:r>
+        <w:rPr>
+          <w:rFonts w:hint="eastAsia"/>
+        </w:rPr>
+        <w:t xml:space="preserve">这一替换的效果在两千窗口的语料上做了前后对照，其余设定完全相同，结构阈值取</w:t>
+      </w:r>
+      <w:r>
+        <w:rPr>
+          <w:rFonts w:hint="eastAsia"/>
+        </w:rPr>
+        <w:t xml:space="preserve"> </w:t>
+      </w:r>
+      <m:oMath>
+        <m:r>
+          <m:t>τ</m:t>
+        </m:r>
+        <m:r>
+          <m:rPr>
+            <m:sty m:val="p"/>
+          </m:rPr>
+          <m:t>=</m:t>
+        </m:r>
+        <m:r>
+          <m:t>0.02</m:t>
+        </m:r>
+      </m:oMath>
+      <w:r>
+        <w:rPr>
+          <w:rFonts w:hint="eastAsia"/>
+        </w:rPr>
+        <w:t xml:space="preserve">，模型池为三后端，语料种子为 42。对照分三臂，因为与该替换同批落地的还有局部结构距离的方差项与分布外判据的尺度无关化，三者一起翻转只能回答这一批是否有用，回答不了其中哪一项有用。仅翻转风险替换的一臂用于隔离本项，全部翻转的一臂给出这一批的合计效果。</w:t>
+      </w:r>
+    </w:p>
+    <w:p>
+      <w:pPr>
+        <w:ind w:firstLineChars="200" w:firstLine="420"/>
+      </w:pPr>
+      <w:r>
+        <w:rPr>
+          <w:rFonts w:hint="eastAsia"/>
+        </w:rPr>
+        <w:t xml:space="preserve">结果分两部分。风险条件本身的行为变化是明确的，旧式下该条件在全部候选上一次也没有触发，否决次数为零，替换之后单独一臂上升到 16 次，全部翻转的一臂为 15 次。这说明旧式的问题不止于方向反了，它在当前阈值下根本没有约束力，三个条件里实际起作用的只有两个。受保护层误编辑数由 78 降至 76，损害由 0.002173 降至 0.002128。</w:t>
+      </w:r>
+    </w:p>
+    <w:p>
+      <w:pPr>
+        <w:ind w:firstLineChars="200" w:firstLine="420"/>
+      </w:pPr>
+      <w:r>
+        <w:rPr>
+          <w:rFonts w:hint="eastAsia"/>
+        </w:rPr>
+        <w:t xml:space="preserve">另一部分的结论是负面的，需要如实记下。仅做该替换带来的损害下降幅度很小，而三项一起翻转时损害降至 0.001462，误编辑降至 65，可见这一批的收益主要来自另外两项而不是风险替换。按后验置信度排序的选择性执行曲线在三臂上都没有转向，最确信十分之一的错误率分别为 0.4545 与 0.4762 与 0.4737，对应的全体错误率为 0.2773 与 0.2823 与 0.2408。这一结果并不与替换的理由冲突，因为后验与编辑成败反向是后验自身的性质，把它从风险式中移除只是使决策不再依赖这一性质，并不能使它变得可靠。该曲线因而仍是弃权机制不能建立在缺陷假设置信度之上的证据，上述数字与前一段引用的 0.595 对 0.484 取自不同的结构阈值设定，绝对水平不可直接比较，可比较的是三档覆盖率下曲线的走向，两次测量一致。</w:t>
       </w:r>
     </w:p>
     <w:p>

</xml_diff>

<commit_message>
Consolidate the experiment plan to five groups, six ablation rungs and five headline metrics
</commit_message>
<xml_diff>
--- a/docx/【work2】胡宏彬-进度文档-20260821.docx
+++ b/docx/【work2】胡宏彬-进度文档-20260821.docx
@@ -16184,13 +16184,12 @@
         <w:rPr>
           <w:rFonts w:hint="eastAsia"/>
         </w:rPr>
-        <w:t xml:space="preserve">定理 6 说明保证的退化与标定间隔成正比、与已积累的访问次数成反比。学习早期访问次数少，同样的间隔带来的退化更大，因此早期应当标定得更密，随着访问次数积累，同样的间隔所对应的退化自动收窄。这为</w:t>
-      </w:r>
-      <w:r>
-        <w:rPr>
-          <w:rFonts w:hint="eastAsia"/>
-        </w:rPr>
-        <w:t xml:space="preserve"> </w:t>
+        <w:t>定理 6 说明保证的退化与标定间隔成正比、与已积累的访问次数成反比。学习早期访问次数少，同样的间隔带来的退化更大，因此早期应当标定得更密，随着访问次数积累，同样的间隔所对应的退化自动收窄。这为  的选取提供了依据，此前只有策略变化快时应当缩短这一定性说法。需要指明该结论依赖间隔条件  为正。上置信界是确定性策略，排序一旦翻转动作分布就跳变，若某个状态下两个动作的置信上界任意接近，则  趋于零而上界失效。该条件的检验方式是统计各状态下  的经验分布，若其下尾接近零则结论应改用期望形式而不是最坏情况形式。实现层面已为此加入记录接口，学习循环在每次存在两个以上可行动作的决策上记下最优与次优置信上界之差，并按标定间隔分段记录该期间被更新格子的最小访问计数， 一并纳入配置哈希，使一次运行无法在报告某个间隔下的上界时实际使用了另一个间隔。该记录不参与任何决策。此处有一点可以先行指出，未被访问过的格子共享同一乐观初值与同一访问计数，其置信上界因而完全相等，只要某个状态上有两个以上这样的格子同时可行， 就恰好为零而不是接近零。这意味着最坏情况形式在探索的早期阶段是按构造失效的，而不是因为数据碰巧出现了接近的取值，因此实测需要报告的是  取零的决策占比与其正值部分的下分位，而不只是一个下确界。实测结果见 4.2 节的消融与敏感性一组。</w:t>
+      </w:r>
+      <w:r>
+        <w:rPr>
+          <w:rFonts w:hint="eastAsia"/>
+        </w:rPr>
       </w:r>
       <m:oMath>
         <m:sSub>
@@ -16225,19 +16224,16 @@
         <w:rPr>
           <w:rFonts w:hint="eastAsia"/>
         </w:rPr>
-        <w:t xml:space="preserve"> </w:t>
-      </w:r>
-      <w:r>
-        <w:rPr>
-          <w:rFonts w:hint="eastAsia"/>
-        </w:rPr>
-        <w:t xml:space="preserve">的选取提供了依据，此前只有策略变化快时应当缩短这一定性说法。需要指明该结论依赖间隔条件</w:t>
-      </w:r>
-      <w:r>
-        <w:rPr>
-          <w:rFonts w:hint="eastAsia"/>
-        </w:rPr>
-        <w:t xml:space="preserve"> </w:t>
+      </w:r>
+      <w:r>
+        <w:rPr>
+          <w:rFonts w:hint="eastAsia"/>
+        </w:rPr>
+      </w:r>
+      <w:r>
+        <w:rPr>
+          <w:rFonts w:hint="eastAsia"/>
+        </w:rPr>
       </w:r>
       <m:oMath>
         <m:r>
@@ -16248,19 +16244,16 @@
         <w:rPr>
           <w:rFonts w:hint="eastAsia"/>
         </w:rPr>
-        <w:t xml:space="preserve"> </w:t>
-      </w:r>
-      <w:r>
-        <w:rPr>
-          <w:rFonts w:hint="eastAsia"/>
-        </w:rPr>
-        <w:t xml:space="preserve">为正。上置信界是确定性策略，排序一旦翻转动作分布就跳变，若某个状态下两个动作的置信上界任意接近，则</w:t>
-      </w:r>
-      <w:r>
-        <w:rPr>
-          <w:rFonts w:hint="eastAsia"/>
-        </w:rPr>
-        <w:t xml:space="preserve"> </w:t>
+      </w:r>
+      <w:r>
+        <w:rPr>
+          <w:rFonts w:hint="eastAsia"/>
+        </w:rPr>
+      </w:r>
+      <w:r>
+        <w:rPr>
+          <w:rFonts w:hint="eastAsia"/>
+        </w:rPr>
       </w:r>
       <m:oMath>
         <m:r>
@@ -16271,19 +16264,16 @@
         <w:rPr>
           <w:rFonts w:hint="eastAsia"/>
         </w:rPr>
-        <w:t xml:space="preserve"> </w:t>
-      </w:r>
-      <w:r>
-        <w:rPr>
-          <w:rFonts w:hint="eastAsia"/>
-        </w:rPr>
-        <w:t xml:space="preserve">趋于零而上界失效。该条件的检验方式是统计各状态下</w:t>
-      </w:r>
-      <w:r>
-        <w:rPr>
-          <w:rFonts w:hint="eastAsia"/>
-        </w:rPr>
-        <w:t xml:space="preserve"> </w:t>
+      </w:r>
+      <w:r>
+        <w:rPr>
+          <w:rFonts w:hint="eastAsia"/>
+        </w:rPr>
+      </w:r>
+      <w:r>
+        <w:rPr>
+          <w:rFonts w:hint="eastAsia"/>
+        </w:rPr>
       </w:r>
       <m:oMath>
         <m:r>
@@ -16294,13 +16284,11 @@
         <w:rPr>
           <w:rFonts w:hint="eastAsia"/>
         </w:rPr>
-        <w:t xml:space="preserve"> </w:t>
-      </w:r>
-      <w:r>
-        <w:rPr>
-          <w:rFonts w:hint="eastAsia"/>
-        </w:rPr>
-        <w:t xml:space="preserve">的经验分布，若其下尾接近零则结论应改用期望形式而不是最坏情况形式。实现层面已为此加入记录接口，学习循环在每次存在两个以上可行动作的决策上记下最优与次优置信上界之差，并按标定间隔分段记录该期间被更新格子的最小访问计数，</w:t>
+      </w:r>
+      <w:r>
+        <w:rPr>
+          <w:rFonts w:hint="eastAsia"/>
+        </w:rPr>
       </w:r>
       <m:oMath>
         <m:sSub>
@@ -16335,13 +16323,11 @@
         <w:rPr>
           <w:rFonts w:hint="eastAsia"/>
         </w:rPr>
-        <w:t xml:space="preserve"> </w:t>
-      </w:r>
-      <w:r>
-        <w:rPr>
-          <w:rFonts w:hint="eastAsia"/>
-        </w:rPr>
-        <w:t xml:space="preserve">一并纳入配置哈希，使一次运行无法在报告某个间隔下的上界时实际使用了另一个间隔。该记录不参与任何决策。此处有一点可以先行指出，未被访问过的格子共享同一乐观初值与同一访问计数，其置信上界因而完全相等，只要某个状态上有两个以上这样的格子同时可行，</w:t>
+      </w:r>
+      <w:r>
+        <w:rPr>
+          <w:rFonts w:hint="eastAsia"/>
+        </w:rPr>
       </w:r>
       <m:oMath>
         <m:r>
@@ -16352,19 +16338,16 @@
         <w:rPr>
           <w:rFonts w:hint="eastAsia"/>
         </w:rPr>
-        <w:t xml:space="preserve"> </w:t>
-      </w:r>
-      <w:r>
-        <w:rPr>
-          <w:rFonts w:hint="eastAsia"/>
-        </w:rPr>
-        <w:t xml:space="preserve">就恰好为零而不是接近零。这意味着最坏情况形式在探索的早期阶段是按构造失效的，而不是因为数据碰巧出现了接近的取值，因此实测需要报告的是</w:t>
-      </w:r>
-      <w:r>
-        <w:rPr>
-          <w:rFonts w:hint="eastAsia"/>
-        </w:rPr>
-        <w:t xml:space="preserve"> </w:t>
+      </w:r>
+      <w:r>
+        <w:rPr>
+          <w:rFonts w:hint="eastAsia"/>
+        </w:rPr>
+      </w:r>
+      <w:r>
+        <w:rPr>
+          <w:rFonts w:hint="eastAsia"/>
+        </w:rPr>
       </w:r>
       <m:oMath>
         <m:r>
@@ -16375,13 +16358,11 @@
         <w:rPr>
           <w:rFonts w:hint="eastAsia"/>
         </w:rPr>
-        <w:t xml:space="preserve"> </w:t>
-      </w:r>
-      <w:r>
-        <w:rPr>
-          <w:rFonts w:hint="eastAsia"/>
-        </w:rPr>
-        <w:t xml:space="preserve">取零的决策占比与其正值部分的下分位，而不只是一个下确界。实测结果见 4.2 节实验六。</w:t>
+      </w:r>
+      <w:r>
+        <w:rPr>
+          <w:rFonts w:hint="eastAsia"/>
+        </w:rPr>
       </w:r>
     </w:p>
     <w:p>
@@ -22171,7 +22152,7 @@
         <w:rPr>
           <w:rFonts w:hint="eastAsia"/>
         </w:rPr>
-        <w:t>本文的做法建立在几个有待检验的判断之上。模型给出的效用读数在需要保护的数据上与有害性方向相反，这是引入结构条件的前提。判定结果作为奖励能够将策略引向可以通过结构检验的修复方式，这是屏蔽的第二重职责。试错发生在副本上因而学习不破坏语料，这是将判定推迟到执行之后所换来的性质。本章的实验规划围绕这几点展开，前四组检验治理后语料的质量是否达到预期，后五组检验智能体的决策本身是否可靠。在此之前先交代数据、噪声注入、基线与指标的设置。</w:t>
+        <w:t xml:space="preserve">本文的做法建立在几个有待检验的判断之上。模型给出的效用读数在需要保护的数据上与有害性方向相反，这是引入结构条件的前提。判定结果作为奖励能够将策略引向可以通过结构检验的修复方式，这是屏蔽的第二重职责。试错发生在副本上因而学习不破坏语料，这是将判定推迟到执行之后所换来的性质。本章的实验规划围绕这几点展开，共五组。主实验在统一语料层协议下与全部基线同表比较，回答治理后的语料是否更好。其后三组各自隔离一个判断，分别是验收信号是否真的会失效、学习过程是否真的不破坏语料、以及策略学习是否真的带来收益。最后一组以消融与敏感性给出各模块的边际贡献与超参数的稳健性。在此之前先交代数据、噪声注入、基线与指标的设置。</w:t>
       </w:r>
     </w:p>
     <w:p/>
@@ -23278,7 +23259,7 @@
         <w:rPr>
           <w:rFonts w:hint="eastAsia"/>
         </w:rPr>
-        <w:t>评价体系分为数据质量与决策质量两组。</w:t>
+        <w:t xml:space="preserve">评价体系分主表与分析两层。主表用于跨方法比较，因此收到五个指标，取的是各族方法都能产出且已发表工作普遍报告的口径。分析层用于解释本文方法内部的行为，进入正文讨论而不进主表，理由是这些量只有产出逐动作裁决的方法才有，打分族在其上一律不适用，放进主表会得到一张多数格子为空的表。</w:t>
       </w:r>
     </w:p>
     <w:p>
@@ -23289,59 +23270,7 @@
         <w:rPr>
           <w:rFonts w:hint="eastAsia"/>
         </w:rPr>
-        <w:t>数据质量组包含四个维度。安全性维度包括受保护层误编辑数、过度清洗率、编辑精度、被破坏窗口数与方差破坏比例。效用维度同时报告模型效用增益与对干净参考的保真度改善，两列在表中相邻放置，便于观察它们在特定缺陷上是否给出方向相反的结论。风险控制维度包括目标风险水平与实测损害率的对照、按受保护层拆分的达标情况以及可达风险下界。下游维度在治理后的语料上训练</w:t>
-      </w:r>
-      <w:r>
-        <w:rPr>
-          <w:rFonts w:hint="eastAsia"/>
-        </w:rPr>
-        <w:t xml:space="preserve"> </w:t>
-      </w:r>
-      <w:proofErr w:type="spellStart"/>
-      <w:r>
-        <w:rPr>
-          <w:rFonts w:hint="eastAsia"/>
-        </w:rPr>
-        <w:t>PatchTST</w:t>
-      </w:r>
-      <w:proofErr w:type="spellEnd"/>
-      <w:r>
-        <w:rPr>
-          <w:rFonts w:hint="eastAsia"/>
-        </w:rPr>
-        <w:t>[25]</w:t>
-      </w:r>
-      <w:r>
-        <w:rPr>
-          <w:rFonts w:hint="eastAsia"/>
-        </w:rPr>
-        <w:t>与</w:t>
-      </w:r>
-      <w:r>
-        <w:rPr>
-          <w:rFonts w:hint="eastAsia"/>
-        </w:rPr>
-        <w:t xml:space="preserve"> </w:t>
-      </w:r>
-      <w:proofErr w:type="spellStart"/>
-      <w:r>
-        <w:rPr>
-          <w:rFonts w:hint="eastAsia"/>
-        </w:rPr>
-        <w:t>DLinear</w:t>
-      </w:r>
-      <w:proofErr w:type="spellEnd"/>
-      <w:r>
-        <w:rPr>
-          <w:rFonts w:hint="eastAsia"/>
-        </w:rPr>
-        <w:t>[26]</w:t>
-      </w:r>
-      <w:r>
-        <w:rPr>
-          <w:rFonts w:hint="eastAsia"/>
-        </w:rPr>
-        <w:t>并报误差，两者分别代表基于注意力与基于线性映射的预测器，采用配对口径以隔离语料采样带来的方差。</w:t>
+        <w:t xml:space="preserve">主表的五个指标如下。下游预测误差在治理后的语料上训练 PatchTST[25]与 DLinear[26]并报误差，两者分别代表基于注意力与基于线性映射的预测器，采用配对口径以隔离语料采样带来的方差，该口径与 TSRating[12]及同期工作一致，便于横向对照。受保护层误编辑数统计干净、稀有与困难三层上被改动的窗口数，它衡量方法在不该动手的地方动手的程度。损害率按定义 1 统计被提交编辑中使窗口更远离干净参考的比例。修复增益统计注入层上对干净参考的距离下降幅度。计算开销以整备全部语料所需的时间与加速器占用衡量，它之所以进主表而不是作为附注，是因为各族的单位代价相差很大，打分族需要反复重训或海森向量积，本文的探测只做前向，不把开销与效果并列，跨族比较就只剩下半张表。</w:t>
       </w:r>
     </w:p>
     <w:p>
@@ -23352,19 +23281,7 @@
         <w:rPr>
           <w:rFonts w:hint="eastAsia"/>
         </w:rPr>
-        <w:t>决策质量组包含四个维度，评估的对象是智能体本身。动作选择准确率在已知缺陷类型的窗口上统计策略选中对应算子的比例，按缺陷类型给出混淆矩阵。预算效率以横轴为累计探测次数、纵轴为治理收益的曲线呈现，用于比较不同预算分配方式。弃权质量以覆盖率与错误率的风险覆盖曲线呈现，用于判断拒绝处理是否发生在应当拒绝的地方。探索代价统计学习过程中累计造成的损害，用于验证定理</w:t>
-      </w:r>
-      <w:r>
-        <w:rPr>
-          <w:rFonts w:hint="eastAsia"/>
-        </w:rPr>
-        <w:t xml:space="preserve"> 4 </w:t>
-      </w:r>
-      <w:r>
-        <w:rPr>
-          <w:rFonts w:hint="eastAsia"/>
-        </w:rPr>
-        <w:t>所述的结构安全性。</w:t>
+        <w:t xml:space="preserve">分析层包含四类量，评估的对象是智能体本身。动作选择准确率在已知缺陷类型的窗口上统计策略选中对应算子的比例，按缺陷类型给出混淆矩阵。预算效率以横轴为累计探测次数、纵轴为治理收益的曲线呈现，用于比较不同的预算分配方式。弃权质量以覆盖率与错误率的风险覆盖曲线呈现，用于判断拒绝处理是否发生在应当拒绝的地方。探索代价统计学习过程中累计造成的损害，用于验证定理 4 所述的结构安全性。这四类都只在产出逐动作裁决的方法上有定义，因此在正文中讨论而不列入主表。</w:t>
       </w:r>
     </w:p>
     <w:p/>
@@ -24232,19 +24149,7 @@
         <w:rPr>
           <w:rFonts w:hint="eastAsia"/>
         </w:rPr>
-        <w:t>实验一确认问题设定成立，即模型行为信号在部分干净数据上会给出与有害性相反的读数。对照取自同为干净但结构相差很远的两组窗口，一组是困难层中季节强度与自相关都很低的窗口，另一组是稀有层中取值落在分布尾部的窗口，两组都未经任何注入。分别统计行为风险的分布并与注入层对照，若信号度量的是可预测程度，三组的读数会按结构复杂度排列，与是否被污染无关。同时统计各层的编辑经济学，即每破坏单位方差换到的效用增益</w:t>
-      </w:r>
-      <w:r>
-        <w:rPr>
-          <w:rFonts w:hint="eastAsia"/>
-        </w:rPr>
-        <w:t xml:space="preserve"> </w:t>
-      </w:r>
-      <w:r>
-        <w:rPr>
-          <w:rFonts w:hint="eastAsia"/>
-        </w:rPr>
-        <w:t>。</w:t>
+        <w:t xml:space="preserve">主实验在统一语料层协议下与全部基线同表比较。各方法从同一份含缺陷语料出发产出各自整备后的语料，用同一下游模型训练并报 4.1.4 节的五个主表指标，表中列全 4.1.3 节的七项基线，某项若因协议不适用而缺列，标注不适用并于表注说明理由，不省略该行。预算分配的效果并入本表而不单独成组，具体做法是在开销一列之外并列两列，收益侧记跳过窗口所省下的探测次数，代价侧记这些窗口中含真实污染的数量。两列必须同时出现，只报节省不报漏检会让这一机制显得没有代价。</w:t>
       </w:r>
     </w:p>
     <w:p>
@@ -24255,7 +24160,7 @@
         <w:rPr>
           <w:rFonts w:hint="eastAsia"/>
         </w:rPr>
-        <w:t>实验二检验本文最核心的机制主张，即屏蔽通过决定哪些奖励到达策略来塑造策略的行为。训练两个策略，一个以未经过滤的效用变化为奖励，另一个以屏蔽后的奖励为奖励，两者共享相同的状态构建、动作空间与学习算法，唯一差别在奖励定义。记录两者在受保护层上提出抹平类动作的频率随训练轮次的变化，以及训练结束时的受保护层误编辑数。该实验属消融，只含本文方法的两个变体，不含基线。</w:t>
+        <w:t xml:space="preserve">实验一刻画验收信号在什么地方失效，这是引入结构条件的前提。模型行为信号在部分干净数据上会给出与有害性相反的读数，该实验确认这一现象是否成立。对照取自同为干净但结构相差很远的两组窗口，一组是困难层中季节强度与自相关都很低的窗口，另一组是稀有层中取值落在分布尾部的窗口，两组都未经任何注入。分别统计行为风险的分布并与注入层对照，若信号度量的是可预测程度，三组的读数会按结构复杂度排列，与是否被污染无关。同时统计各层的编辑经济学，即每破坏单位方差换到的效用增益。该实验列全部基线，用以说明这一失效并非本文方法特有，凡以模型表现为判定依据的方法都会受到影响。</w:t>
       </w:r>
     </w:p>
     <w:p>
@@ -24266,31 +24171,7 @@
         <w:rPr>
           <w:rFonts w:hint="eastAsia"/>
         </w:rPr>
-        <w:t>实验三验证定理</w:t>
-      </w:r>
-      <w:r>
-        <w:rPr>
-          <w:rFonts w:hint="eastAsia"/>
-        </w:rPr>
-        <w:t xml:space="preserve"> 4</w:t>
-      </w:r>
-      <w:r>
-        <w:rPr>
-          <w:rFonts w:hint="eastAsia"/>
-        </w:rPr>
-        <w:t>，即学习过程本身不破坏语料。对比两种训练方式，一种把动作直接作用于原数据后再评估，代表已有强化学习清洗方案的做法，另一种采用本文的沙箱执行。统计训练全过程中累计造成的损害随交互次数的变化，并扫描探索系数</w:t>
-      </w:r>
-      <w:r>
-        <w:rPr>
-          <w:rFonts w:hint="eastAsia"/>
-        </w:rPr>
-        <w:t xml:space="preserve">  </w:t>
-      </w:r>
-      <w:r>
-        <w:rPr>
-          <w:rFonts w:hint="eastAsia"/>
-        </w:rPr>
-        <w:t>观察两种方式的差距如何随探索强度变化。表中同时列出全部基线在同一语料上的最终损害作为参照行。</w:t>
+        <w:t xml:space="preserve">实验二验证定理 4，即学习过程本身不破坏语料。对比两种训练方式，一种把动作直接作用于原数据后再评估，代表已有强化学习清洗方案的做法，另一种采用本文的沙箱执行。统计训练全过程中累计造成的损害随交互次数的变化，并扫描探索系数观察两种方式的差距如何随探索强度变化。表中同时列出全部基线在同一语料上的最终损害作为参照行，基线不进行探索，其损害为一次性产生而非随交互累积，这一差别在表注中说明。</w:t>
       </w:r>
     </w:p>
     <w:p>
@@ -24301,7 +24182,7 @@
         <w:rPr>
           <w:rFonts w:hint="eastAsia"/>
         </w:rPr>
-        <w:t>实验四量化策略学习相对于固定规则的改进，并检验早期版本中重试失效的原因是否为策略无法适应窗口类型。比较随机策略、固定规则策略、本文的学习策略以及知晓真值的理想策略，四者共用同一屏蔽与同一动作空间，并在语料层协议下与全部基线同表比较。除总体指标外，单独统计被否决后更换动作的成功率，与固定规则版本的结果对照。策略学习的增益分两类，一类是在既有候选中重排序，一类是主动尝试提议者从不给出的选项，后者需要强制候选注入才能兑现，两类增益分别统计。由于经屏蔽裁决的候选接受率本身不高，损害与修复上的改善预计温和，主要差距应出现在预算效率一组。</w:t>
+        <w:t xml:space="preserve">实验三量化策略学习相对于固定规则的改进，这是本文强化学习定位的直接支撑。比较随机策略、固定规则策略、本文的学习策略以及知晓真值的理想策略，四者共用同一屏蔽与同一动作空间，并在语料层协议下与全部基线同表比较。除总体指标外，单独统计被否决后更换动作的成功率，与固定规则版本的结果对照，用以检验早期版本中重试失效的原因是否为策略无法适应窗口类型。策略学习的增益分两类，一类是在既有候选中重排序，一类是主动尝试提议者从不给出的选项，后者需要强制候选注入才能兑现，两类增益分别统计。由于经屏蔽裁决的候选接受率本身不高，损害与修复上的改善预计温和，主要差距应出现在主实验的开销与探测次数两列上。</w:t>
       </w:r>
     </w:p>
     <w:p>
@@ -24312,39 +24193,7 @@
         <w:rPr>
           <w:rFonts w:hint="eastAsia"/>
         </w:rPr>
-        <w:t>实验五检验按价值分配探测预算是否优于均匀分配。固定语料总预算，比较均匀分配、按风险分数分配与本文按价值估计分配三种方式。曲线的横轴取计算开销，这样打分族可以一并参与，因为</w:t>
-      </w:r>
-      <w:r>
-        <w:rPr>
-          <w:rFonts w:hint="eastAsia"/>
-        </w:rPr>
-        <w:t xml:space="preserve"> Data Shapley </w:t>
-      </w:r>
-      <w:r>
-        <w:rPr>
-          <w:rFonts w:hint="eastAsia"/>
-        </w:rPr>
-        <w:t>需要反复重训、</w:t>
-      </w:r>
-      <w:proofErr w:type="spellStart"/>
-      <w:r>
-        <w:rPr>
-          <w:rFonts w:hint="eastAsia"/>
-        </w:rPr>
-        <w:t>TimeInf</w:t>
-      </w:r>
-      <w:proofErr w:type="spellEnd"/>
-      <w:r>
-        <w:rPr>
-          <w:rFonts w:hint="eastAsia"/>
-        </w:rPr>
-        <w:t xml:space="preserve"> </w:t>
-      </w:r>
-      <w:r>
-        <w:rPr>
-          <w:rFonts w:hint="eastAsia"/>
-        </w:rPr>
-        <w:t>需要海森向量积、本文的探测只做前向，三者的单位开销不同，按探测次数比较对打分族没有意义。按探测次数的版本另行给出，用于本文方法内部三种分配方式的对比。收益与代价必须同表呈现，跳过窗口省下的探测次数与其中含真实污染的窗口数并列，只报节省不报漏检会让这一机制显得没有代价。</w:t>
+        <w:t xml:space="preserve">第五组以消融与敏感性给出各模块的边际贡献与超参数的稳健性，只含本文方法的各档变体，不含基线。消融收为六档，即无屏蔽、无结构条件、无策略学习、无候选注入、以原始效用为奖励与完整方法。其中以原始效用为奖励一档承担原先单独成组的奖励塑形对照，它与完整方法只差奖励定义，前者用未经过滤的效用变化，后者用屏蔽后的奖励，记录两者在受保护层上提出削平类动作的频率随训练轮次的变化，这是 3.3 节所述屏蔽第二重职责的直接检验。每档报告损害与修复两栏，并额外报告每次编辑的平均损害与平均修复，以消除编辑数差异的干扰。敏感性部分扫描目标损害率、探索系数、注入概率与标定间隔，其中标定间隔一档用于检验定理 6 给出的退化上界与实测退化是否吻合，并统计各状态下置信上界间隔的经验分布与其取零的比例，以判断该定理所需的间隔条件在本文设定中何时开始满足。</w:t>
       </w:r>
     </w:p>
     <w:p>
@@ -24355,79 +24204,7 @@
         <w:rPr>
           <w:rFonts w:hint="eastAsia"/>
         </w:rPr>
-        <w:t>实验</w:t>
-      </w:r>
-      <w:r>
-        <w:rPr>
-          <w:rFonts w:hint="eastAsia"/>
-        </w:rPr>
-        <w:t>六</w:t>
-      </w:r>
-      <w:r>
-        <w:rPr>
-          <w:rFonts w:hint="eastAsia"/>
-        </w:rPr>
-        <w:t>量化各模块的边际贡献并检验方法对超参数的稳健性。消融包含无屏蔽、无效用条件、无结构条件、无同类校准、无策略学习、无预算分配、无候选注入与完整方法八档，每档报告损害与修复两栏，并额外报告每次编辑的平均损害与平均修复，以消除编辑数差异的干扰。敏感性部分扫描目标损害率</w:t>
-      </w:r>
-      <w:r>
-        <w:rPr>
-          <w:rFonts w:hint="eastAsia"/>
-        </w:rPr>
-        <w:t xml:space="preserve"> </w:t>
-      </w:r>
-      <w:r>
-        <w:rPr>
-          <w:rFonts w:hint="eastAsia"/>
-        </w:rPr>
-        <w:t>、探索系数</w:t>
-      </w:r>
-      <w:r>
-        <w:rPr>
-          <w:rFonts w:hint="eastAsia"/>
-        </w:rPr>
-        <w:t xml:space="preserve"> </w:t>
-      </w:r>
-      <w:r>
-        <w:rPr>
-          <w:rFonts w:hint="eastAsia"/>
-        </w:rPr>
-        <w:t>、注入概率</w:t>
-      </w:r>
-      <w:r>
-        <w:rPr>
-          <w:rFonts w:hint="eastAsia"/>
-        </w:rPr>
-        <w:t xml:space="preserve">  </w:t>
-      </w:r>
-      <w:r>
-        <w:rPr>
-          <w:rFonts w:hint="eastAsia"/>
-        </w:rPr>
-        <w:t>与标定间隔</w:t>
-      </w:r>
-      <w:r>
-        <w:rPr>
-          <w:rFonts w:hint="eastAsia"/>
-        </w:rPr>
-        <w:t xml:space="preserve"> </w:t>
-      </w:r>
-      <w:r>
-        <w:rPr>
-          <w:rFonts w:hint="eastAsia"/>
-        </w:rPr>
-        <w:t>，其中标定间隔一档用于检验定理</w:t>
-      </w:r>
-      <w:r>
-        <w:rPr>
-          <w:rFonts w:hint="eastAsia"/>
-        </w:rPr>
-        <w:t xml:space="preserve"> 6 </w:t>
-      </w:r>
-      <w:r>
-        <w:rPr>
-          <w:rFonts w:hint="eastAsia"/>
-        </w:rPr>
-        <w:t>给出的退化上界与实测退化是否吻合，并统计各状态下置信上界间隔的经验分布，以判断该定理所需的间隔条件在本文设定中是否成立。</w:t>
+        <w:t xml:space="preserve">消融档位的取舍有依据，一并记下以免被读作随意删减。无效用条件一档去掉，理由是实测中效用条件的否决次数远高于结构条件，在两千窗口上分别为 769 次与 616 次，去掉效用条件之后剩下的接受集与无屏蔽相差很小，两档给出的信息高度重复。无预算分配一档去掉，理由是该机制的效果已经由主实验的开销列与探测次数两列直接呈现，再设一档只是把同一件事换个位置报一遍。无同类校准一档去掉，理由是早期实测已经表明它与全局标准化在判别力上没有可检出的差别，该结论及其数据保留在 6.1 节，不占用消融的位置。这三档的去除都基于已有实测而不是预算考虑，若后续数据推翻上述任何一条，对应档位应当恢复。</w:t>
       </w:r>
     </w:p>
     <w:p>

</xml_diff>

<commit_message>
Add LTSV as a baseline and record the TSRating and blockability measurements in 4.1.3
</commit_message>
<xml_diff>
--- a/docx/【work2】胡宏彬-进度文档-20260821.docx
+++ b/docx/【work2】胡宏彬-进度文档-20260821.docx
@@ -456,6 +456,11 @@
               <w:t>[12]</w:t>
             </w:r>
           </w:p>
+          <w:p>
+            <w:r>
+              <w:t>LTSV[29]</w:t>
+            </w:r>
+          </w:p>
         </w:tc>
         <w:tc>
           <w:tcPr>
@@ -1714,7 +1719,18 @@
         <w:rPr>
           <w:rFonts w:hint="eastAsia"/>
         </w:rPr>
-        <w:t>这一方向的产出始终是分数或排序。它能够指出哪些窗口存在问题，却无法说明这些窗口应当如何处理，也不具备检验某次处理是否有效的机制。当低分窗口中混有稀有但正确的模式时，按分数丢弃会将其一并去除。</w:t>
+        <w:t xml:space="preserve">另一支近期工作把估值直接建立在时序基础模型之上。LTSV[29]指出影响函数在基础模型规模上升时难以扩展，转而以一步上下文微调近似影响函数，用留出上下文损失在该次微调前后的下降量作为一个片段的取值，再以时间块聚合还原逐点分数以保留时间依赖。该做法把估值所需的开销从海森求逆降到一次前向与一次反向，与本文以冻结模型的前向反应作为证据的思路同源，差别在于它的产出仍是分数，用于取舍而不用于处理。</w:t>
+      </w:r>
+    </w:p>
+    <w:p>
+      <w:pPr>
+        <w:ind w:firstLineChars="200" w:firstLine="420"/>
+      </w:pPr>
+      <w:r>
+        <w:rPr>
+          <w:rFonts w:hint="eastAsia"/>
+        </w:rPr>
+        <w:t xml:space="preserve">这一方向的产出始终是分数或排序。它能够指出哪些窗口存在问题，却无法说明这些窗口应当如何处理，也不具备检验某次处理是否有效的机制。当低分窗口中混有稀有但正确的模式时，按分数丢弃会将其一并去除。还有一处限制来自输入形式，这一族把窗口展开为监督样本再打分，而监督样本无法承载缺失值，含缺失的窗口因此进不了它们的输入，这类窗口恰好是插补最该发挥作用的地方。</w:t>
       </w:r>
     </w:p>
     <w:p/>
@@ -22918,14 +22934,7 @@
         <w:rPr>
           <w:rFonts w:hint="eastAsia"/>
         </w:rPr>
-        <w:t>基线的选取有三条标准。每一项都有可查证的正式发表出处，全部基线合起来覆盖问题所处的两个方法族，</w:t>
-      </w:r>
-      <w:r>
-        <w:rPr>
-          <w:rFonts w:hint="eastAsia"/>
-        </w:rPr>
-        <w:lastRenderedPageBreak/>
-        <w:t>每一项都隔离出其余各项不涉及的一个变量。按这三条筛选后保留七项，非消融实验的表格一律列全这七项，某项若因协议不适用而缺列，在表中标注不适用并于表注说明理由，不得省略该行。</w:t>
+        <w:t xml:space="preserve">基线的选取有三条标准。每一项都有可查证的正式发表出处，全部基线合起来覆盖问题所处的两个方法族，每一项都隔离出其余各项不涉及的一个变量。按这三条筛选后保留八项，非消融实验的表格一律列全这八项，某项若因协议不适用而缺列，在表中标注不适用并于表注说明理由，不得省略该行。</w:t>
       </w:r>
     </w:p>
     <w:p>
@@ -23055,163 +23064,7 @@
         <w:rPr>
           <w:rFonts w:hint="eastAsia"/>
         </w:rPr>
-        <w:t>（</w:t>
-      </w:r>
-      <w:r>
-        <w:rPr>
-          <w:rFonts w:hint="eastAsia"/>
-        </w:rPr>
-        <w:t>5</w:t>
-      </w:r>
-      <w:r>
-        <w:rPr>
-          <w:rFonts w:hint="eastAsia"/>
-        </w:rPr>
-        <w:t>）</w:t>
-      </w:r>
-      <w:proofErr w:type="spellStart"/>
-      <w:r>
-        <w:rPr>
-          <w:rFonts w:hint="eastAsia"/>
-        </w:rPr>
-        <w:t>TimeInf</w:t>
-      </w:r>
-      <w:proofErr w:type="spellEnd"/>
-      <w:r>
-        <w:rPr>
-          <w:rFonts w:hint="eastAsia"/>
-        </w:rPr>
-        <w:t>[11]</w:t>
-      </w:r>
-      <w:r>
-        <w:rPr>
-          <w:rFonts w:hint="eastAsia"/>
-        </w:rPr>
-        <w:t>，把影响函数定义在时间块上再聚合到时间点，代表打分式选择路线中面向时序设计的一支。打分族的四项工作在产出形式上一致，都给样本分数再按分数取舍，彼此的差别在估值器而不在产出，而本文的比较发生在整备后语料这一层，因此保留面向时序的</w:t>
-      </w:r>
-      <w:r>
-        <w:rPr>
-          <w:rFonts w:hint="eastAsia"/>
-        </w:rPr>
-        <w:t xml:space="preserve"> </w:t>
-      </w:r>
-      <w:proofErr w:type="spellStart"/>
-      <w:r>
-        <w:rPr>
-          <w:rFonts w:hint="eastAsia"/>
-        </w:rPr>
-        <w:t>TimeInf</w:t>
-      </w:r>
-      <w:proofErr w:type="spellEnd"/>
-      <w:r>
-        <w:rPr>
-          <w:rFonts w:hint="eastAsia"/>
-        </w:rPr>
-        <w:t xml:space="preserve"> </w:t>
-      </w:r>
-      <w:r>
-        <w:rPr>
-          <w:rFonts w:hint="eastAsia"/>
-        </w:rPr>
-        <w:t>与通用估值中开销最低的</w:t>
-      </w:r>
-      <w:r>
-        <w:rPr>
-          <w:rFonts w:hint="eastAsia"/>
-        </w:rPr>
-        <w:t xml:space="preserve"> Data-OOB[10]</w:t>
-      </w:r>
-      <w:r>
-        <w:rPr>
-          <w:rFonts w:hint="eastAsia"/>
-        </w:rPr>
-        <w:t>两项，（</w:t>
-      </w:r>
-      <w:r>
-        <w:rPr>
-          <w:rFonts w:hint="eastAsia"/>
-        </w:rPr>
-        <w:t>6</w:t>
-      </w:r>
-      <w:r>
-        <w:rPr>
-          <w:rFonts w:hint="eastAsia"/>
-        </w:rPr>
-        <w:t>）</w:t>
-      </w:r>
-      <w:r>
-        <w:rPr>
-          <w:rFonts w:hint="eastAsia"/>
-        </w:rPr>
-        <w:t xml:space="preserve">Data-OOB </w:t>
-      </w:r>
-      <w:r>
-        <w:rPr>
-          <w:rFonts w:hint="eastAsia"/>
-        </w:rPr>
-        <w:t>用袋外估计给出样本价值，隔离的变量是估值方法忽略时间依赖时会损失什么。</w:t>
-      </w:r>
-      <w:r>
-        <w:rPr>
-          <w:rFonts w:hint="eastAsia"/>
-        </w:rPr>
-        <w:t xml:space="preserve">Data Shapley </w:t>
-      </w:r>
-      <w:r>
-        <w:rPr>
-          <w:rFonts w:hint="eastAsia"/>
-        </w:rPr>
-        <w:t>与</w:t>
-      </w:r>
-      <w:r>
-        <w:rPr>
-          <w:rFonts w:hint="eastAsia"/>
-        </w:rPr>
-        <w:t xml:space="preserve"> </w:t>
-      </w:r>
-      <w:proofErr w:type="spellStart"/>
-      <w:r>
-        <w:rPr>
-          <w:rFonts w:hint="eastAsia"/>
-        </w:rPr>
-        <w:t>TSRating</w:t>
-      </w:r>
-      <w:proofErr w:type="spellEnd"/>
-      <w:r>
-        <w:rPr>
-          <w:rFonts w:hint="eastAsia"/>
-        </w:rPr>
-        <w:t xml:space="preserve"> </w:t>
-      </w:r>
-      <w:r>
-        <w:rPr>
-          <w:rFonts w:hint="eastAsia"/>
-        </w:rPr>
-        <w:t>不单列，前者与</w:t>
-      </w:r>
-      <w:r>
-        <w:rPr>
-          <w:rFonts w:hint="eastAsia"/>
-        </w:rPr>
-        <w:t xml:space="preserve"> Data-OOB </w:t>
-      </w:r>
-      <w:r>
-        <w:rPr>
-          <w:rFonts w:hint="eastAsia"/>
-        </w:rPr>
-        <w:t>同属博弈论估值而开销高出一个量级，后者依赖外部大模型判断，其可得性不由本文控制。（</w:t>
-      </w:r>
-      <w:r>
-        <w:rPr>
-          <w:rFonts w:hint="eastAsia"/>
-        </w:rPr>
-        <w:t>7</w:t>
-      </w:r>
-      <w:r>
-        <w:rPr>
-          <w:rFonts w:hint="eastAsia"/>
-        </w:rPr>
-        <w:t>）学习策略不配屏蔽，即把算子直接作用于原数据，代表同期强化学习清洗方案的做法，隔离的变量是屏蔽本身的有无。</w:t>
+        <w:t xml:space="preserve">（5）TimeInf[11]，把影响函数定义在时间块上再聚合到时间点，代表打分式选择路线中面向时序设计的一支。（6）Data-OOB[10]，用袋外估计给出样本价值，隔离的变量是估值方法忽略时间依赖时会损失什么。（7）LTSV[29]，在冻结的时序基础模型上做一步上下文微调，以留出上下文损失的下降量作为片段取值，再按时间块聚合到窗口，隔离的变量是估值直接建立在基础模型行为之上而不是建立在一个替代回归模型之上。该项与本文的取证环节最为接近，两者都读取冻结模型对一个窗口的反应，差别在于它只据此给出分数，本文据此选择并裁决一次编辑。打分族的其余工作在产出形式上一致，都给样本分数再按分数取舍，彼此的差别在估值器而不在产出，而本文的比较发生在整备后语料这一层，因此 Data Shapley 与 KNN Shapley 不单列，前者与 Data-OOB 同属博弈论估值而开销高出一个量级。（8）学习策略不配屏蔽，即把算子直接作用于原数据，代表同期强化学习清洗方案的做法，隔离的变量是屏蔽本身的有无。</w:t>
       </w:r>
     </w:p>
     <w:p>
@@ -23234,6 +23087,39 @@
           <w:rFonts w:hint="eastAsia"/>
         </w:rPr>
         <w:t>软惩罚、单信号屏蔽与随机策略三种对照只在针对裁决方式与策略来源的两组实验中出现，它们改变的是本文方法内部的一个环节而不是一个独立的已发表方法，因此不计入基线清单，在对应实验中作为本文方法的变体列出。消融实验只含本文方法的各档变体，不要求含基线。</w:t>
+      </w:r>
+    </w:p>
+    <w:p>
+      <w:pPr>
+        <w:ind w:firstLineChars="200" w:firstLine="420"/>
+      </w:pPr>
+      <w:r>
+        <w:rPr>
+          <w:rFonts w:hint="eastAsia"/>
+        </w:rPr>
+        <w:t xml:space="preserve">TSRating[12]不进入基线清单，理由是一次实测而不是可得性的笼统说法。该方法从大模型的成对判断蒸馏出评分器，其可用性取决于判断本身是否稳定，因此在任何标注开始之前先做了一次一致性检查，模板、序列化、生成次数与解析全部沿用原仓库，只替换判断后端。取 15 对窗口，每对以正反两种呈现顺序各判断 20 次，覆盖趋势、频率、幅度与模式四个维度。结果是交换呈现顺序之后偏好翻转的比例为 0.508，即与抛硬币无异。机制可以直接读出，把两种顺序合起来统计，73.6% 的票投给了排在前面的那个选项，中位数为 76.0%，60 个配对维度中有 17 个的首位得票率不低于 90%，这是位置偏好而不是判断。该方法自带的两序平均也未能挽回，平均之后有 24 个配对维度落在它自己视为未决的区间内。需要限定的是，这是关于后端替换的结论而不是关于该方法的结论，原文在其所用的判断后端上报告结果，此处确立的是所替换的后端在该配置下不复现该方法所假定的判断行为。</w:t>
+      </w:r>
+    </w:p>
+    <w:p>
+      <w:pPr>
+        <w:ind w:firstLineChars="200" w:firstLine="420"/>
+      </w:pPr>
+      <w:r>
+        <w:rPr>
+          <w:rFonts w:hint="eastAsia"/>
+        </w:rPr>
+        <w:t xml:space="preserve">这一检查同时给出了一个与主表计算开销一列直接相关的数字。按实测的每对每维开销外推，两千窗口乘四个维度约需 16000 个配对维度，折合约 2100 元与 32 小时。依赖外部大模型判断的方法因而在语料规模上存在成本门槛，而本文的证据来自对冻结模型的前向探测，其开销随语料线性增长且不涉及外部服务。这一对照是主表保留计算开销一列的实测依据之一。</w:t>
+      </w:r>
+    </w:p>
+    <w:p>
+      <w:pPr>
+        <w:ind w:firstLineChars="200" w:firstLine="420"/>
+      </w:pPr>
+      <w:r>
+        <w:rPr>
+          <w:rFonts w:hint="eastAsia"/>
+        </w:rPr>
+        <w:t xml:space="preserve">打分族在缺失类缺陷上还有一处结构性局限，它在本文的语料上以一个可测的比例出现，因此写在这里而不是留作实现细节。这一族的方法把窗口展开为监督样本再打分，而监督样本无法承载缺失值，于是注入了缺失的窗口根本进不了它们的输入。在 210 个窗口的语料上实测，有 40 个窗口因此无法切块，占比 19%，恰好是插补算子存在的那一类窗口。本文的处理规则在任何分数产生之前定死，这些窗口不从比较中剔除，而是作为未被选中带进每个打分臂的整备语料，理由是给不出分数的窗口本来就留不住，这正是该族在此类数据上的真实行为。事前对它们插补的做法被否决，那会把本文算子的产物送进基线的输入，使基线在一份已经受过干预的语料上受评。该比例在主表中与选择比例并列给出，它也是打分族与本文方法在缺失类缺陷上产生差异的直接来源。</w:t>
       </w:r>
     </w:p>
     <w:p/>
@@ -24806,6 +24692,14 @@
       </w:pPr>
       <w:r>
         <w:t>[28] Real-TSF Team. TIME: A benchmark of real world time series for forecasting model evaluation[EB/OL]. Hugging Face dataset, 2025</w:t>
+      </w:r>
+    </w:p>
+    <w:p>
+      <w:pPr>
+        <w:ind w:left="420" w:hangingChars="200" w:hanging="420"/>
+      </w:pPr>
+      <w:r>
+        <w:t xml:space="preserve">[29] Lightweight time series data valuation on time series foundation models via in-context finetuning[C]//Proceedings of the 31st International Conference on Database Systems for Advanced Applications. 2026</w:t>
       </w:r>
     </w:p>
     <w:sectPr>

</xml_diff>

<commit_message>
Characterise the reasoning mode parse failures as truncation, not refusal
</commit_message>
<xml_diff>
--- a/docx/【work2】胡宏彬-进度文档-20260821.docx
+++ b/docx/【work2】胡宏彬-进度文档-20260821.docx
@@ -23109,6 +23109,17 @@
           <w:rFonts w:hint="eastAsia"/>
         </w:rPr>
         <w:t xml:space="preserve">这一检查同时给出了一个与主表计算开销一列直接相关的数字。按实测的每对每维开销外推，两千窗口乘四个维度约需 16000 个配对维度，折合约 2100 元与 32 小时。依赖外部大模型判断的方法因而在语料规模上存在成本门槛，而本文的证据来自对冻结模型的前向探测，其开销随语料线性增长且不涉及外部服务。这一对照是主表保留计算开销一列的实测依据之一。</w:t>
+      </w:r>
+    </w:p>
+    <w:p>
+      <w:pPr>
+        <w:ind w:firstLineChars="200" w:firstLine="420"/>
+      </w:pPr>
+      <w:r>
+        <w:rPr>
+          <w:rFonts w:hint="eastAsia"/>
+        </w:rPr>
+        <w:t xml:space="preserve">该后端的推理模式单独试过一次，结论是这条路同样不通，但失效方式不同，因此一并记下。打开推理之后可计分的配对全部一致，翻转率为零，但可计分的只有 24 个配对维度中的 16 个，不可计分率为 0.333，零翻转因而不能单独作为结论。逐条查看原始回复可以定性，失败并非模型给不出判断，也不是回复格式不符，而是推理占满了输出预算。一个典型的不可计分样本上，第一次生成的结束原因为长度，推理消耗 2048 个 token 而正文为空，同一配对的第二次生成推理消耗 416 个 token 并正常给出判断。这意味着被丢弃的恰是模型推理更长的那些配对，而推理更长通常对应更难判断的配对，于是留下的是模型觉得容易的那一部分，零翻转属于幸存者偏差。两个数字因此必须同时报告，关闭推理时翻转率 0.508 而不可计分率为零，打开推理时翻转率为零而不可计分率 0.333。两种配置的唯一差异是输出上限由 8 提高到 2048，这一改动由模式本身强制而非选择，关闭推理时每次调用的推理开销约 23 个 token，打开后约 1440 个。该项到此为止，不再追加分支，TSRating 因而不进入基线清单，在全基线表中保留该行并标注不适用及上述理由。</w:t>
       </w:r>
     </w:p>
     <w:p>

</xml_diff>

<commit_message>
Switch both protected layers to selection and record the self checks on their counts
</commit_message>
<xml_diff>
--- a/docx/【work2】胡宏彬-进度文档-20260821.docx
+++ b/docx/【work2】胡宏彬-进度文档-20260821.docx
@@ -22909,6 +22909,50 @@
           <w:rFonts w:hint="eastAsia"/>
         </w:rPr>
         <w:t>评测集按窗口的来源与是否被注入分为四层。注入层是施加了上述两类噪声的窗口，治理应当处理它们。干净层未做任何注入，治理不应改动它们。稀有层从真实数据中筛选，取的是取值落在分布尾部但完全未经注入的窗口，金融语料中的剧烈波动时段与工业语料中的启停时段都属于此类。困难层同样来自真实数据，取季节强度与自相关都较低因而难以预测但完全干净的窗口。后两层与干净层统称受保护层，其上的任何编辑都计为损害。稀有层与困难层取自数据本身而不是合成构造，这样保护对象的定义不依赖于注入过程，避免了设计缺陷同时又设计保护对象所带来的循环。</w:t>
+      </w:r>
+    </w:p>
+    <w:p>
+      <w:pPr>
+        <w:ind w:firstLineChars="200" w:firstLine="420"/>
+      </w:pPr>
+      <w:r>
+        <w:rPr>
+          <w:rFonts w:hint="eastAsia"/>
+        </w:rPr>
+        <w:t xml:space="preserve">稀有层与变点层由筛选给出而不是由构造给出，两层的判据在任何筛选结果产生之前写定。稀有层要求窗口触及该通道自身取值分布的尾部、越尾点占比不超过窗口的百分之五、且首尾四分位的中位数之差不超过半个四分位距，三条合起来刻画的是一次幅度大、持续短、并回到基线的真实事件。变点层取分段均值之差除以合并的段内标准差这一统计量，在尺度保持且不同时属于稀有层的窗口中，按族内秩取前若干。</w:t>
+      </w:r>
+    </w:p>
+    <w:p>
+      <w:pPr>
+        <w:ind w:firstLineChars="200" w:firstLine="420"/>
+      </w:pPr>
+      <w:r>
+        <w:rPr>
+          <w:rFonts w:hint="eastAsia"/>
+        </w:rPr>
+        <w:t xml:space="preserve">变点层采用秩而不是阈值，理由来自一次实测而不是偏好。该统计量在三种单位下各测了两族每族 400 个窗口，没有一种单位能把两类语料放到同一尺度上，金融语料在分块稳健尺度与合并段内标准差两个单位下的中位数，都高于工业语料的九十分位。这不是阈值松紧的问题而是数据本身的性质，利率曲线的整体平移是每周都会发生的事，而变压器改变运行状态不是。任何单一阈值因此要么在工业语料上几乎筛不出东西，要么在金融语料上几乎全部收入。秩对单调重标度不变，两族各按自身分布取前若干，这与窗口筛选中以同通道同长度窗口的典型尺度作参照是同一个理由。</w:t>
+      </w:r>
+    </w:p>
+    <w:p>
+      <w:pPr>
+        <w:ind w:firstLineChars="200" w:firstLine="420"/>
+      </w:pPr>
+      <w:r>
+        <w:rPr>
+          <w:rFonts w:hint="eastAsia"/>
+        </w:rPr>
+        <w:t xml:space="preserve">两版判据的对照可以说明这一改动的必要性。以绝对阈值表达时，1600 个窗口的池中只筛出 4 个变点窗口，六个数据集中有四个一个也没有。改为族内秩之后筛出 180 个，六个数据集全部提供该层，两族均无缺口。这一对照支撑本节关于稀有层与变点层取自数据本身而不是合成构造的表述，若该层只能靠合成构造填满，则设计缺陷者同时设计保护对象这一质疑仍然成立。</w:t>
+      </w:r>
+    </w:p>
+    <w:p>
+      <w:pPr>
+        <w:ind w:firstLineChars="200" w:firstLine="420"/>
+      </w:pPr>
+      <w:r>
+        <w:rPr>
+          <w:rFonts w:hint="eastAsia"/>
+        </w:rPr>
+        <w:t xml:space="preserve">秩规则的代价一并写明。它总会返回结果，因而无法报告某类语料确实不存在合法变点，绝对阈值可以而它不能。作为补偿，选中层的统计量分布与注入水平位移之后的同一统计量分布并列报告，若两者相差很远，则该层是比它自称更弱的检验，无论结果如何都如实给出。</w:t>
       </w:r>
     </w:p>
     <w:p/>

</xml_diff>

<commit_message>
Redefine difficulty by predictability and correct the unblockable share to a relation
</commit_message>
<xml_diff>
--- a/docx/【work2】胡宏彬-进度文档-20260821.docx
+++ b/docx/【work2】胡宏彬-进度文档-20260821.docx
@@ -22955,19 +22955,15 @@
         <w:t xml:space="preserve">秩规则的代价一并写明。它总会返回结果，因而无法报告某类语料确实不存在合法变点，绝对阈值可以而它不能。作为补偿，选中层的统计量分布与注入水平位移之后的同一统计量分布并列报告，若两者相差很远，则该层是比它自称更弱的检验，无论结果如何都如实给出。</w:t>
       </w:r>
     </w:p>
-    <w:p/>
     <w:p>
-      <w:r>
-        <w:rPr>
-          <w:rFonts w:hint="eastAsia"/>
-        </w:rPr>
-        <w:t xml:space="preserve">4.1.3 </w:t>
-      </w:r>
-      <w:r>
-        <w:rPr>
-          <w:rFonts w:hint="eastAsia"/>
-        </w:rPr>
-        <w:t>基线方法</w:t>
+      <w:pPr>
+        <w:ind w:firstLineChars="200" w:firstLine="420"/>
+      </w:pPr>
+      <w:r>
+        <w:rPr>
+          <w:rFonts w:hint="eastAsia"/>
+        </w:rPr>
+        <w:t xml:space="preserve">困难层的判据同样经过一次修正，其理由是定义错误而不是某一族筛不出窗口。原判据取季节强度与短滞后自相关的补，而接近随机游走的序列这两项都很高，于是被判为容易，随机游走却是预测问题中的经典困难例，统计量与它所命名的概念方向相反。这一判断独立于语料构成，在一份没有金融数据的语料上同样成立。现判据直接由可预测性定义困难，取差分序列上线性自回归所能解释的方差占比，以其补作为难度，这一形式对重标度不变，且与 2.2 节关于行为信号度量的是可预测程度这一表述相一致，原判据恰恰在窗口难以预测时称其容易，两处此前是矛盾的。</w:t>
       </w:r>
     </w:p>
     <w:p>
@@ -22978,7 +22974,7 @@
         <w:rPr>
           <w:rFonts w:hint="eastAsia"/>
         </w:rPr>
-        <w:t xml:space="preserve">基线的选取有三条标准。每一项都有可查证的正式发表出处，全部基线合起来覆盖问题所处的两个方法族，每一项都隔离出其余各项不涉及的一个变量。按这三条筛选后保留八项，非消融实验的表格一律列全这八项，某项若因协议不适用而缺列，在表中标注不适用并于表注说明理由，不得省略该行。</w:t>
+        <w:t xml:space="preserve">两版判据在两类语料上的分布对照本身就是新判据正确的证据。原判据下工业与金融的难度中位分别为 0.1905 与 0.0105，相差十八倍，且方向与实际的预测难度相反。新判据下两者为 0.8338 与 0.9151，相差在一成以内，方向一致。新判据下金融仍略高于工业，这一位移按信号处理而不是按误差处理，金融价格序列比设备遥测更接近随机游走，一个能正确识别随机游走为困难的统计量本就应当把它们排得更高。由于金融的五分位数高于工业的二十五分位数，全局排序会使该层几乎只来自一类语料，因此困难层同样采用族内秩。</w:t>
       </w:r>
     </w:p>
     <w:p>
@@ -22989,115 +22985,22 @@
         <w:rPr>
           <w:rFonts w:hint="eastAsia"/>
         </w:rPr>
-        <w:t>（</w:t>
-      </w:r>
-      <w:r>
-        <w:rPr>
-          <w:rFonts w:hint="eastAsia"/>
-        </w:rPr>
-        <w:t>1</w:t>
-      </w:r>
-      <w:r>
-        <w:rPr>
-          <w:rFonts w:hint="eastAsia"/>
-        </w:rPr>
-        <w:t>）不治理，作为参照下界，其损害恒为零，用于确认任何非零损害都来自方法本身，与评测流程无关。（</w:t>
-      </w:r>
-      <w:r>
-        <w:rPr>
-          <w:rFonts w:hint="eastAsia"/>
-        </w:rPr>
-        <w:t>2</w:t>
-      </w:r>
-      <w:r>
-        <w:rPr>
-          <w:rFonts w:hint="eastAsia"/>
-        </w:rPr>
-        <w:t>）</w:t>
-      </w:r>
-      <w:r>
-        <w:rPr>
-          <w:rFonts w:hint="eastAsia"/>
-        </w:rPr>
-        <w:t>SCREEN[5]</w:t>
-      </w:r>
-      <w:r>
-        <w:rPr>
-          <w:rFonts w:hint="eastAsia"/>
-        </w:rPr>
-        <w:t>，速度约束下的局部最优修复，代表约束驱动的清洗路线，隔离的变量是修复规则完全由领域约束给定时能走到哪里。（</w:t>
-      </w:r>
-      <w:r>
-        <w:rPr>
-          <w:rFonts w:hint="eastAsia"/>
-        </w:rPr>
-        <w:t>3</w:t>
-      </w:r>
-      <w:r>
-        <w:rPr>
-          <w:rFonts w:hint="eastAsia"/>
-        </w:rPr>
-        <w:t>）</w:t>
-      </w:r>
-      <w:r>
-        <w:rPr>
-          <w:rFonts w:hint="eastAsia"/>
-        </w:rPr>
-        <w:t>IMR[6]</w:t>
-      </w:r>
-      <w:r>
-        <w:rPr>
-          <w:rFonts w:hint="eastAsia"/>
-        </w:rPr>
-        <w:t>，自回归模型迭代修复，代表统计建模驱动的清洗路线，隔离的变量是把修复依据从人工约束换成数据自身的统计结构。（</w:t>
-      </w:r>
-      <w:r>
-        <w:rPr>
-          <w:rFonts w:hint="eastAsia"/>
-        </w:rPr>
-        <w:t>4</w:t>
-      </w:r>
-      <w:r>
-        <w:rPr>
-          <w:rFonts w:hint="eastAsia"/>
-        </w:rPr>
-        <w:t>）</w:t>
-      </w:r>
-      <w:r>
-        <w:rPr>
-          <w:rFonts w:hint="eastAsia"/>
-        </w:rPr>
-        <w:t>MTCSC[8]</w:t>
-      </w:r>
-      <w:r>
-        <w:rPr>
-          <w:rFonts w:hint="eastAsia"/>
-        </w:rPr>
-        <w:t>的单变量分支，</w:t>
-      </w:r>
-      <w:r>
-        <w:rPr>
-          <w:rFonts w:hint="eastAsia"/>
-        </w:rPr>
-        <w:t xml:space="preserve">2024 </w:t>
-      </w:r>
-      <w:r>
-        <w:rPr>
-          <w:rFonts w:hint="eastAsia"/>
-        </w:rPr>
-        <w:t>年的速度约束工作，它与</w:t>
-      </w:r>
-      <w:r>
-        <w:rPr>
-          <w:rFonts w:hint="eastAsia"/>
-        </w:rPr>
-        <w:t xml:space="preserve"> SCREEN </w:t>
-      </w:r>
-      <w:r>
-        <w:rPr>
-          <w:rFonts w:hint="eastAsia"/>
-        </w:rPr>
-        <w:t>的编辑重合度分窗口、改动位置与修复取值三个层次实测，三个层次都高度一致才合并为一行，否则各自单列。</w:t>
+        <w:t xml:space="preserve">稀有层存在一处程度较轻的来源偏向，如实写明而不作修正。各数据集的合格率相差很大，工业在 0.075 至 0.173 之间，金融在 0.015 至 0.043 之间，其中池规模最大的一项合格率反而最低，仅为 0.015，约为最高者的十一分之一。这说明缺口不是配额与池规模不匹配，而是判据在各数据集上的自然产出差异。机制来自判据中回到基线这一条，它要求窗口首尾四分位的中位数之差不超过半个四分位距，而金融序列普遍带有趋势，首尾差距因此常常超出该限。该层由此偏向工业语料，但金融仍有贡献，在 201 个窗口中占 37 个。</w:t>
+      </w:r>
+    </w:p>
+    <w:p/>
+    <w:p>
+      <w:r>
+        <w:rPr>
+          <w:rFonts w:hint="eastAsia"/>
+        </w:rPr>
+        <w:t xml:space="preserve">4.1.3 </w:t>
+      </w:r>
+      <w:r>
+        <w:rPr>
+          <w:rFonts w:hint="eastAsia"/>
+        </w:rPr>
+        <w:t>基线方法</w:t>
       </w:r>
     </w:p>
     <w:p>
@@ -23108,7 +23011,7 @@
         <w:rPr>
           <w:rFonts w:hint="eastAsia"/>
         </w:rPr>
-        <w:t xml:space="preserve">（5）TimeInf[11]，把影响函数定义在时间块上再聚合到时间点，代表打分式选择路线中面向时序设计的一支。（6）Data-OOB[10]，用袋外估计给出样本价值，隔离的变量是估值方法忽略时间依赖时会损失什么。（7）LTSV[29]，在冻结的时序基础模型上做一步上下文微调，以留出上下文损失的下降量作为片段取值，再按时间块聚合到窗口，隔离的变量是估值直接建立在基础模型行为之上而不是建立在一个替代回归模型之上。该项与本文的取证环节最为接近，两者都读取冻结模型对一个窗口的反应，差别在于它只据此给出分数，本文据此选择并裁决一次编辑。打分族的其余工作在产出形式上一致，都给样本分数再按分数取舍，彼此的差别在估值器而不在产出，而本文的比较发生在整备后语料这一层，因此 Data Shapley 与 KNN Shapley 不单列，前者与 Data-OOB 同属博弈论估值而开销高出一个量级。（8）学习策略不配屏蔽，即把算子直接作用于原数据，代表同期强化学习清洗方案的做法，隔离的变量是屏蔽本身的有无。</w:t>
+        <w:t xml:space="preserve">基线的选取有三条标准。每一项都有可查证的正式发表出处，全部基线合起来覆盖问题所处的两个方法族，每一项都隔离出其余各项不涉及的一个变量。按这三条筛选后保留八项，非消融实验的表格一律列全这八项，某项若因协议不适用而缺列，在表中标注不适用并于表注说明理由，不得省略该行。</w:t>
       </w:r>
     </w:p>
     <w:p>
@@ -23119,7 +23022,115 @@
         <w:rPr>
           <w:rFonts w:hint="eastAsia"/>
         </w:rPr>
-        <w:t>上述基线分属不同族，产出形式不同，因此采用两套协议以保证每一项都能参与比较。语料层协议下各方法产出整备后的语料，用同一下游模型训练并报同一组指标，打分族与清洗族在此层完全可比。候选层协议用于需要逐动作裁决的分析，例如接受率与撤销原因的拆解，参与者为清洗族与本文方法，打分族不产出逐动作决策，在此层标注为不适用。</w:t>
+        <w:t>（</w:t>
+      </w:r>
+      <w:r>
+        <w:rPr>
+          <w:rFonts w:hint="eastAsia"/>
+        </w:rPr>
+        <w:t>1</w:t>
+      </w:r>
+      <w:r>
+        <w:rPr>
+          <w:rFonts w:hint="eastAsia"/>
+        </w:rPr>
+        <w:t>）不治理，作为参照下界，其损害恒为零，用于确认任何非零损害都来自方法本身，与评测流程无关。（</w:t>
+      </w:r>
+      <w:r>
+        <w:rPr>
+          <w:rFonts w:hint="eastAsia"/>
+        </w:rPr>
+        <w:t>2</w:t>
+      </w:r>
+      <w:r>
+        <w:rPr>
+          <w:rFonts w:hint="eastAsia"/>
+        </w:rPr>
+        <w:t>）</w:t>
+      </w:r>
+      <w:r>
+        <w:rPr>
+          <w:rFonts w:hint="eastAsia"/>
+        </w:rPr>
+        <w:t>SCREEN[5]</w:t>
+      </w:r>
+      <w:r>
+        <w:rPr>
+          <w:rFonts w:hint="eastAsia"/>
+        </w:rPr>
+        <w:t>，速度约束下的局部最优修复，代表约束驱动的清洗路线，隔离的变量是修复规则完全由领域约束给定时能走到哪里。（</w:t>
+      </w:r>
+      <w:r>
+        <w:rPr>
+          <w:rFonts w:hint="eastAsia"/>
+        </w:rPr>
+        <w:t>3</w:t>
+      </w:r>
+      <w:r>
+        <w:rPr>
+          <w:rFonts w:hint="eastAsia"/>
+        </w:rPr>
+        <w:t>）</w:t>
+      </w:r>
+      <w:r>
+        <w:rPr>
+          <w:rFonts w:hint="eastAsia"/>
+        </w:rPr>
+        <w:t>IMR[6]</w:t>
+      </w:r>
+      <w:r>
+        <w:rPr>
+          <w:rFonts w:hint="eastAsia"/>
+        </w:rPr>
+        <w:t>，自回归模型迭代修复，代表统计建模驱动的清洗路线，隔离的变量是把修复依据从人工约束换成数据自身的统计结构。（</w:t>
+      </w:r>
+      <w:r>
+        <w:rPr>
+          <w:rFonts w:hint="eastAsia"/>
+        </w:rPr>
+        <w:t>4</w:t>
+      </w:r>
+      <w:r>
+        <w:rPr>
+          <w:rFonts w:hint="eastAsia"/>
+        </w:rPr>
+        <w:t>）</w:t>
+      </w:r>
+      <w:r>
+        <w:rPr>
+          <w:rFonts w:hint="eastAsia"/>
+        </w:rPr>
+        <w:t>MTCSC[8]</w:t>
+      </w:r>
+      <w:r>
+        <w:rPr>
+          <w:rFonts w:hint="eastAsia"/>
+        </w:rPr>
+        <w:t>的单变量分支，</w:t>
+      </w:r>
+      <w:r>
+        <w:rPr>
+          <w:rFonts w:hint="eastAsia"/>
+        </w:rPr>
+        <w:t xml:space="preserve">2024 </w:t>
+      </w:r>
+      <w:r>
+        <w:rPr>
+          <w:rFonts w:hint="eastAsia"/>
+        </w:rPr>
+        <w:t>年的速度约束工作，它与</w:t>
+      </w:r>
+      <w:r>
+        <w:rPr>
+          <w:rFonts w:hint="eastAsia"/>
+        </w:rPr>
+        <w:t xml:space="preserve"> SCREEN </w:t>
+      </w:r>
+      <w:r>
+        <w:rPr>
+          <w:rFonts w:hint="eastAsia"/>
+        </w:rPr>
+        <w:t>的编辑重合度分窗口、改动位置与修复取值三个层次实测，三个层次都高度一致才合并为一行，否则各自单列。</w:t>
       </w:r>
     </w:p>
     <w:p>
@@ -23130,7 +23141,7 @@
         <w:rPr>
           <w:rFonts w:hint="eastAsia"/>
         </w:rPr>
-        <w:t>软惩罚、单信号屏蔽与随机策略三种对照只在针对裁决方式与策略来源的两组实验中出现，它们改变的是本文方法内部的一个环节而不是一个独立的已发表方法，因此不计入基线清单，在对应实验中作为本文方法的变体列出。消融实验只含本文方法的各档变体，不要求含基线。</w:t>
+        <w:t xml:space="preserve">（5）TimeInf[11]，把影响函数定义在时间块上再聚合到时间点，代表打分式选择路线中面向时序设计的一支。（6）Data-OOB[10]，用袋外估计给出样本价值，隔离的变量是估值方法忽略时间依赖时会损失什么。（7）LTSV[29]，在冻结的时序基础模型上做一步上下文微调，以留出上下文损失的下降量作为片段取值，再按时间块聚合到窗口，隔离的变量是估值直接建立在基础模型行为之上而不是建立在一个替代回归模型之上。该项与本文的取证环节最为接近，两者都读取冻结模型对一个窗口的反应，差别在于它只据此给出分数，本文据此选择并裁决一次编辑。打分族的其余工作在产出形式上一致，都给样本分数再按分数取舍，彼此的差别在估值器而不在产出，而本文的比较发生在整备后语料这一层，因此 Data Shapley 与 KNN Shapley 不单列，前者与 Data-OOB 同属博弈论估值而开销高出一个量级。（8）学习策略不配屏蔽，即把算子直接作用于原数据，代表同期强化学习清洗方案的做法，隔离的变量是屏蔽本身的有无。</w:t>
       </w:r>
     </w:p>
     <w:p>
@@ -23141,7 +23152,7 @@
         <w:rPr>
           <w:rFonts w:hint="eastAsia"/>
         </w:rPr>
-        <w:t xml:space="preserve">TSRating[12]不进入基线清单，理由是一次实测而不是可得性的笼统说法。该方法从大模型的成对判断蒸馏出评分器，其可用性取决于判断本身是否稳定，因此在任何标注开始之前先做了一次一致性检查，模板、序列化、生成次数与解析全部沿用原仓库，只替换判断后端。取 15 对窗口，每对以正反两种呈现顺序各判断 20 次，覆盖趋势、频率、幅度与模式四个维度。结果是交换呈现顺序之后偏好翻转的比例为 0.508，即与抛硬币无异。机制可以直接读出，把两种顺序合起来统计，73.6% 的票投给了排在前面的那个选项，中位数为 76.0%，60 个配对维度中有 17 个的首位得票率不低于 90%，这是位置偏好而不是判断。该方法自带的两序平均也未能挽回，平均之后有 24 个配对维度落在它自己视为未决的区间内。需要限定的是，这是关于后端替换的结论而不是关于该方法的结论，原文在其所用的判断后端上报告结果，此处确立的是所替换的后端在该配置下不复现该方法所假定的判断行为。</w:t>
+        <w:t>上述基线分属不同族，产出形式不同，因此采用两套协议以保证每一项都能参与比较。语料层协议下各方法产出整备后的语料，用同一下游模型训练并报同一组指标，打分族与清洗族在此层完全可比。候选层协议用于需要逐动作裁决的分析，例如接受率与撤销原因的拆解，参与者为清洗族与本文方法，打分族不产出逐动作决策，在此层标注为不适用。</w:t>
       </w:r>
     </w:p>
     <w:p>
@@ -23152,7 +23163,7 @@
         <w:rPr>
           <w:rFonts w:hint="eastAsia"/>
         </w:rPr>
-        <w:t xml:space="preserve">这一检查同时给出了一个与主表计算开销一列直接相关的数字。按实测的每对每维开销外推，两千窗口乘四个维度约需 16000 个配对维度，折合约 2100 元与 32 小时。依赖外部大模型判断的方法因而在语料规模上存在成本门槛，而本文的证据来自对冻结模型的前向探测，其开销随语料线性增长且不涉及外部服务。这一对照是主表保留计算开销一列的实测依据之一。</w:t>
+        <w:t>软惩罚、单信号屏蔽与随机策略三种对照只在针对裁决方式与策略来源的两组实验中出现，它们改变的是本文方法内部的一个环节而不是一个独立的已发表方法，因此不计入基线清单，在对应实验中作为本文方法的变体列出。消融实验只含本文方法的各档变体，不要求含基线。</w:t>
       </w:r>
     </w:p>
     <w:p>
@@ -23163,7 +23174,7 @@
         <w:rPr>
           <w:rFonts w:hint="eastAsia"/>
         </w:rPr>
-        <w:t xml:space="preserve">该后端的推理模式单独试过一次，结论是这条路同样不通，但失效方式不同，因此一并记下。打开推理之后可计分的配对全部一致，翻转率为零，但可计分的只有 24 个配对维度中的 16 个，不可计分率为 0.333，零翻转因而不能单独作为结论。逐条查看原始回复可以定性，失败并非模型给不出判断，也不是回复格式不符，而是推理占满了输出预算。一个典型的不可计分样本上，第一次生成的结束原因为长度，推理消耗 2048 个 token 而正文为空，同一配对的第二次生成推理消耗 416 个 token 并正常给出判断。这意味着被丢弃的恰是模型推理更长的那些配对，而推理更长通常对应更难判断的配对，于是留下的是模型觉得容易的那一部分，零翻转属于幸存者偏差。两个数字因此必须同时报告，关闭推理时翻转率 0.508 而不可计分率为零，打开推理时翻转率为零而不可计分率 0.333。两种配置的唯一差异是输出上限由 8 提高到 2048，这一改动由模式本身强制而非选择，关闭推理时每次调用的推理开销约 23 个 token，打开后约 1440 个。该项到此为止，不再追加分支，TSRating 因而不进入基线清单，在全基线表中保留该行并标注不适用及上述理由。</w:t>
+        <w:t xml:space="preserve">TSRating[12]不进入基线清单，理由是一次实测而不是可得性的笼统说法。该方法从大模型的成对判断蒸馏出评分器，其可用性取决于判断本身是否稳定，因此在任何标注开始之前先做了一次一致性检查，模板、序列化、生成次数与解析全部沿用原仓库，只替换判断后端。取 15 对窗口，每对以正反两种呈现顺序各判断 20 次，覆盖趋势、频率、幅度与模式四个维度。结果是交换呈现顺序之后偏好翻转的比例为 0.508，即与抛硬币无异。机制可以直接读出，把两种顺序合起来统计，73.6% 的票投给了排在前面的那个选项，中位数为 76.0%，60 个配对维度中有 17 个的首位得票率不低于 90%，这是位置偏好而不是判断。该方法自带的两序平均也未能挽回，平均之后有 24 个配对维度落在它自己视为未决的区间内。需要限定的是，这是关于后端替换的结论而不是关于该方法的结论，原文在其所用的判断后端上报告结果，此处确立的是所替换的后端在该配置下不复现该方法所假定的判断行为。</w:t>
       </w:r>
     </w:p>
     <w:p>
@@ -23174,7 +23185,29 @@
         <w:rPr>
           <w:rFonts w:hint="eastAsia"/>
         </w:rPr>
-        <w:t xml:space="preserve">打分族在缺失类缺陷上还有一处结构性局限，它在本文的语料上以一个可测的比例出现，因此写在这里而不是留作实现细节。这一族的方法把窗口展开为监督样本再打分，而监督样本无法承载缺失值，于是注入了缺失的窗口根本进不了它们的输入。在 210 个窗口的语料上实测，有 40 个窗口因此无法切块，占比 19%，恰好是插补算子存在的那一类窗口。本文的处理规则在任何分数产生之前定死，这些窗口不从比较中剔除，而是作为未被选中带进每个打分臂的整备语料，理由是给不出分数的窗口本来就留不住，这正是该族在此类数据上的真实行为。事前对它们插补的做法被否决，那会把本文算子的产物送进基线的输入，使基线在一份已经受过干预的语料上受评。该比例在主表中与选择比例并列给出，它也是打分族与本文方法在缺失类缺陷上产生差异的直接来源。</w:t>
+        <w:t xml:space="preserve">这一检查同时给出了一个与主表计算开销一列直接相关的数字。按实测的每对每维开销外推，两千窗口乘四个维度约需 16000 个配对维度，折合约 2100 元与 32 小时。依赖外部大模型判断的方法因而在语料规模上存在成本门槛，而本文的证据来自对冻结模型的前向探测，其开销随语料线性增长且不涉及外部服务。这一对照是主表保留计算开销一列的实测依据之一。</w:t>
+      </w:r>
+    </w:p>
+    <w:p>
+      <w:pPr>
+        <w:ind w:firstLineChars="200" w:firstLine="420"/>
+      </w:pPr>
+      <w:r>
+        <w:rPr>
+          <w:rFonts w:hint="eastAsia"/>
+        </w:rPr>
+        <w:t xml:space="preserve">该后端的推理模式单独试过一次，结论是这条路同样不通，但失效方式不同，因此一并记下。打开推理之后可计分的配对全部一致，翻转率为零，但可计分的只有 24 个配对维度中的 16 个，不可计分率为 0.333，零翻转因而不能单独作为结论。逐条查看原始回复可以定性，失败并非模型给不出判断，也不是回复格式不符，而是推理占满了输出预算。一个典型的不可计分样本上，第一次生成的结束原因为长度，推理消耗 2048 个 token 而正文为空，同一配对的第二次生成推理消耗 416 个 token 并正常给出判断。这意味着被丢弃的恰是模型推理更长的那些配对，而推理更长通常对应更难判断的配对，于是留下的是模型觉得容易的那一部分，零翻转属于幸存者偏差。两个数字因此必须同时报告，关闭推理时翻转率 0.508 而不可计分率为零，打开推理时翻转率为零而不可计分率 0.333。两种配置的唯一差异是输出上限由 8 提高到 2048，这一改动由模式本身强制而非选择，关闭推理时每次调用的推理开销约 23 个 token，打开后约 1440 个。该项到此为止，不再追加分支，TSRating 因而不进入基线清单，在全基线表中保留该行并标注不适用及上述理由。</w:t>
+      </w:r>
+    </w:p>
+    <w:p>
+      <w:pPr>
+        <w:ind w:firstLineChars="200" w:firstLine="420"/>
+      </w:pPr>
+      <w:r>
+        <w:rPr>
+          <w:rFonts w:hint="eastAsia"/>
+        </w:rPr>
+        <w:t xml:space="preserve">打分族在缺失类缺陷上还有一处结构性局限，它在本文的语料上以一个可以预先算出的比例出现，因此写在这里而不是留作实现细节。这一族的方法把窗口展开为监督样本再打分，而监督样本无法承载缺失值，于是注入了缺失的窗口根本进不了它们的输入。该比例不是一个常数，它等于注入层在语料中的占比乘以七种缺陷中会产生缺失的两种，即注入层占比乘以七分之二。两份语料上的实测与该关系吻合，注入层占六成七的语料上为 19%，占三成七的语料上预测为 0.1057 而实测为 0.1060。报告这一关系比报告某一个比例更有用，因为它说明该族失效的范围随语料的含缺失比例而定，注入层占比越高，这一族无法处理的部分越大。本文的处理规则在任何分数产生之前定死，这些窗口不从比较中剔除，而是作为未被选中带进每个打分臂的整备语料，理由是给不出分数的窗口本来就留不住，这正是该族在此类数据上的真实行为。事前对它们插补的做法被否决，那会把本文算子的产物送进基线的输入，使基线在一份已经受过干预的语料上受评。该比例在主表中与选择比例并列给出，它也是打分族与本文方法在缺失类缺陷上产生差异的直接来源。</w:t>
       </w:r>
     </w:p>
     <w:p/>
@@ -24101,7 +24134,7 @@
         <w:rPr>
           <w:rFonts w:hint="eastAsia"/>
         </w:rPr>
-        <w:t xml:space="preserve">实验一刻画验收信号在什么地方失效，这是引入结构条件的前提。模型行为信号在部分干净数据上会给出与有害性相反的读数，该实验确认这一现象是否成立。对照取自同为干净但结构相差很远的两组窗口，一组是困难层中季节强度与自相关都很低的窗口，另一组是稀有层中取值落在分布尾部的窗口，两组都未经任何注入。分别统计行为风险的分布并与注入层对照，若信号度量的是可预测程度，三组的读数会按结构复杂度排列，与是否被污染无关。同时统计各层的编辑经济学，即每破坏单位方差换到的效用增益。该实验列全部基线，用以说明这一失效并非本文方法特有，凡以模型表现为判定依据的方法都会受到影响。</w:t>
+        <w:t xml:space="preserve">实验一刻画验收信号在什么地方失效，这是引入结构条件的前提。模型行为信号在部分干净数据上会给出与有害性相反的读数，该实验确认这一现象是否成立。对照取自同为干净但结构相差很远的两组窗口，一组是困难层中难以预测的窗口，另一组是稀有层中取值落在分布尾部的窗口，两组都未经任何注入。这里有一条关系到该实验是否成立的设置，困难层的判据不使用被判模型的任何分量。该实验要问的正是行为信号会不会把干净但复杂的数据误读为低质，若困难层由同一信号定义，那么被问的结论就已经写进了语料的构造之中，实验成为循环论证。因此困难层由差分序列上的可预测程度这一纯统计量给出，与模型池无关。分别统计行为风险的分布并与注入层对照，若信号度量的是可预测程度，三组的读数会按结构复杂度排列，与是否被污染无关。同时统计各层的编辑经济学，即每破坏单位方差换到的效用增益。该实验列全部基线，用以说明这一失效并非本文方法特有，凡以模型表现为判定依据的方法都会受到影响。</w:t>
       </w:r>
     </w:p>
     <w:p>

</xml_diff>

<commit_message>
Make injected candidates take each operator's least aggressive setting, section 3.4
</commit_message>
<xml_diff>
--- a/docx/【work2】胡宏彬-进度文档-20260821.docx
+++ b/docx/【work2】胡宏彬-进度文档-20260821.docx
@@ -17617,100 +17617,84 @@
         <w:rPr>
           <w:rFonts w:hint="eastAsia"/>
         </w:rPr>
-        <w:t>乐观初始化的作用范围有一个边界，实测把它暴露了出来。上置信界只在提议者给出的候选集内选择，乐观初值再高也无法选中没有被提出的动作。首次在两千窗口上运行学习循环时，簇</w:t>
-      </w:r>
-      <w:r>
-        <w:rPr>
-          <w:rFonts w:hint="eastAsia"/>
-        </w:rPr>
-        <w:t xml:space="preserve"> 1 </w:t>
-      </w:r>
-      <w:r>
-        <w:rPr>
-          <w:rFonts w:hint="eastAsia"/>
-        </w:rPr>
-        <w:t>与簇</w:t>
-      </w:r>
-      <w:r>
-        <w:rPr>
-          <w:rFonts w:hint="eastAsia"/>
-        </w:rPr>
-        <w:t xml:space="preserve"> 11 </w:t>
-      </w:r>
-      <w:r>
-        <w:rPr>
-          <w:rFonts w:hint="eastAsia"/>
-        </w:rPr>
-        <w:t>上的去噪访问次数为零，两簇合计</w:t>
-      </w:r>
-      <w:r>
-        <w:rPr>
-          <w:rFonts w:hint="eastAsia"/>
-        </w:rPr>
-        <w:t xml:space="preserve"> 392 </w:t>
-      </w:r>
-      <w:r>
-        <w:rPr>
-          <w:rFonts w:hint="eastAsia"/>
-        </w:rPr>
-        <w:t>个窗口占语料百分之十九点六，原因是提议者的候选集由主导缺陷决定，而这些窗口的主导缺陷从不是噪声。乐观初始化作用在选择层，这里的盲区却在提议层，层次不对应，因而无效。本文</w:t>
-      </w:r>
-      <w:r>
-        <w:rPr>
-          <w:rFonts w:hint="eastAsia"/>
-        </w:rPr>
-        <w:lastRenderedPageBreak/>
-        <w:t>为此引入强制候选注入，当某个画像簇与算子的组合没有任何观测时，以概率</w:t>
-      </w:r>
-      <w:r>
-        <w:rPr>
-          <w:rFonts w:hint="eastAsia"/>
-        </w:rPr>
-        <w:t xml:space="preserve"> </w:t>
+        <w:t>乐观初始化的作用范围有一个边界，实测把它暴露了出来。上置信界只在提议者给出的候选集内选择，乐观初值再高也无法选中没有被提出的动作。首次在两千窗口上运行学习循环时，簇 1 与簇 11 上的去噪访问次数为零，两簇合计 392 个窗口占语料百分之十九点六，原因是提议者的候选集由主导缺陷决定，而这些窗口的主导缺陷从不是噪声。乐观初始化作用在选择层，这里的盲区却在提议层，层次不对应，因而无效。本文为此引入强制候选注入，当某个画像簇与算子的组合没有任何观测时，以概率 p_inject 把该算子直接加入候选集，注入的候选照常经过沙箱与完整屏蔽。注入的候选取该算子最不激进的设定，因为它探的是一个尚无信息的格子，不宜同时带上激进的设定。重分段一列的情形与此不同，它整列取全局均值 0.6095，低于空格的乐观初值 1.0，因此学习早期不会被选中。这是乐观初始化按设计驱动探索的结果，配合阶段零已经证明该算子没有簇级结构，早期不访问它不会损失可学的信息。</w:t>
+      </w:r>
+      <w:r>
+        <w:rPr>
+          <w:rFonts w:hint="eastAsia"/>
+        </w:rPr>
+      </w:r>
+      <w:r>
+        <w:rPr>
+          <w:rFonts w:hint="eastAsia"/>
+        </w:rPr>
+      </w:r>
+      <w:r>
+        <w:rPr>
+          <w:rFonts w:hint="eastAsia"/>
+        </w:rPr>
+      </w:r>
+      <w:r>
+        <w:rPr>
+          <w:rFonts w:hint="eastAsia"/>
+        </w:rPr>
+      </w:r>
+      <w:r>
+        <w:rPr>
+          <w:rFonts w:hint="eastAsia"/>
+        </w:rPr>
+      </w:r>
+      <w:r>
+        <w:rPr>
+          <w:rFonts w:hint="eastAsia"/>
+        </w:rPr>
+      </w:r>
+      <w:r>
+        <w:rPr>
+          <w:rFonts w:hint="eastAsia"/>
+        </w:rPr>
+      </w:r>
+      <w:r>
+        <w:rPr>
+          <w:rFonts w:hint="eastAsia"/>
+        </w:rPr>
       </w:r>
       <w:proofErr w:type="spellStart"/>
       <w:r>
         <w:rPr>
           <w:rFonts w:hint="eastAsia"/>
         </w:rPr>
-        <w:t>p_inject</w:t>
       </w:r>
       <w:proofErr w:type="spellEnd"/>
       <w:r>
         <w:rPr>
           <w:rFonts w:hint="eastAsia"/>
         </w:rPr>
-        <w:t xml:space="preserve"> </w:t>
-      </w:r>
-      <w:r>
-        <w:rPr>
-          <w:rFonts w:hint="eastAsia"/>
-        </w:rPr>
-        <w:t>把该算子直接加入候选集，注入的候选照常经过沙箱与完整屏蔽。注入的候选取该算子最保守的参数，因为它探的是一个尚无信息的格子，不宜同时带上激进的设定。重分段一列的情形与此不同，它整列取全局均值</w:t>
-      </w:r>
-      <w:r>
-        <w:rPr>
-          <w:rFonts w:hint="eastAsia"/>
-        </w:rPr>
-        <w:t xml:space="preserve"> 0.6095</w:t>
-      </w:r>
-      <w:r>
-        <w:rPr>
-          <w:rFonts w:hint="eastAsia"/>
-        </w:rPr>
-        <w:t>，低于空格的乐观初值</w:t>
-      </w:r>
-      <w:r>
-        <w:rPr>
-          <w:rFonts w:hint="eastAsia"/>
-        </w:rPr>
-        <w:t xml:space="preserve"> 1.0</w:t>
-      </w:r>
-      <w:r>
-        <w:rPr>
-          <w:rFonts w:hint="eastAsia"/>
-        </w:rPr>
-        <w:t>，因此学习早期不会被选中。这是乐观初始化按设计驱动探索的结果，配合阶段零已经证明该算子没有簇级结构，早期不访问它不会损失可学的信息。</w:t>
+      </w:r>
+      <w:r>
+        <w:rPr>
+          <w:rFonts w:hint="eastAsia"/>
+        </w:rPr>
+      </w:r>
+      <w:r>
+        <w:rPr>
+          <w:rFonts w:hint="eastAsia"/>
+        </w:rPr>
+      </w:r>
+      <w:r>
+        <w:rPr>
+          <w:rFonts w:hint="eastAsia"/>
+        </w:rPr>
+      </w:r>
+      <w:r>
+        <w:rPr>
+          <w:rFonts w:hint="eastAsia"/>
+        </w:rPr>
+      </w:r>
+      <w:r>
+        <w:rPr>
+          <w:rFonts w:hint="eastAsia"/>
+        </w:rPr>
       </w:r>
     </w:p>
     <w:p>

</xml_diff>

<commit_message>
Rebuild the ablation ladder on six rungs with SPO, and align three hyperparameters
</commit_message>
<xml_diff>
--- a/docx/【work2】胡宏彬-进度文档-20260821.docx
+++ b/docx/【work2】胡宏彬-进度文档-20260821.docx
@@ -17787,390 +17787,7 @@
         <w:rPr>
           <w:rFonts w:hint="eastAsia"/>
         </w:rPr>
-        <w:t>分位数的下界有实测依据。取</w:t>
-      </w:r>
-      <w:r>
-        <w:rPr>
-          <w:rFonts w:hint="eastAsia"/>
-        </w:rPr>
-        <w:t xml:space="preserve"> 90 </w:t>
-      </w:r>
-      <w:r>
-        <w:rPr>
-          <w:rFonts w:hint="eastAsia"/>
-        </w:rPr>
-        <w:t>与</w:t>
-      </w:r>
-      <w:r>
-        <w:rPr>
-          <w:rFonts w:hint="eastAsia"/>
-        </w:rPr>
-        <w:t xml:space="preserve"> 95 </w:t>
-      </w:r>
-      <w:r>
-        <w:rPr>
-          <w:rFonts w:hint="eastAsia"/>
-        </w:rPr>
-        <w:t>与</w:t>
-      </w:r>
-      <w:r>
-        <w:rPr>
-          <w:rFonts w:hint="eastAsia"/>
-        </w:rPr>
-        <w:t xml:space="preserve"> 99 </w:t>
-      </w:r>
-      <w:r>
-        <w:rPr>
-          <w:rFonts w:hint="eastAsia"/>
-        </w:rPr>
-        <w:t>三档重建价值表并比较策略在同一语料上选出的动作，</w:t>
-      </w:r>
-      <w:r>
-        <w:rPr>
-          <w:rFonts w:hint="eastAsia"/>
-        </w:rPr>
-        <w:t xml:space="preserve">95 </w:t>
-      </w:r>
-      <w:r>
-        <w:rPr>
-          <w:rFonts w:hint="eastAsia"/>
-        </w:rPr>
-        <w:t>与</w:t>
-      </w:r>
-      <w:r>
-        <w:rPr>
-          <w:rFonts w:hint="eastAsia"/>
-        </w:rPr>
-        <w:t xml:space="preserve"> 99 </w:t>
-      </w:r>
-      <w:r>
-        <w:rPr>
-          <w:rFonts w:hint="eastAsia"/>
-        </w:rPr>
-        <w:t>两档选中同一动作的窗口比例为</w:t>
-      </w:r>
-      <w:r>
-        <w:rPr>
-          <w:rFonts w:hint="eastAsia"/>
-        </w:rPr>
-        <w:t xml:space="preserve"> 0.9860</w:t>
-      </w:r>
-      <w:r>
-        <w:rPr>
-          <w:rFonts w:hint="eastAsia"/>
-        </w:rPr>
-        <w:t>，价值表全序的肯德尔相关系数为</w:t>
-      </w:r>
-      <w:r>
-        <w:rPr>
-          <w:rFonts w:hint="eastAsia"/>
-        </w:rPr>
-        <w:t xml:space="preserve"> 0.9759</w:t>
-      </w:r>
-      <w:r>
-        <w:rPr>
-          <w:rFonts w:hint="eastAsia"/>
-        </w:rPr>
-        <w:t>，两档之间几乎没有差别。</w:t>
-      </w:r>
-      <w:r>
-        <w:rPr>
-          <w:rFonts w:hint="eastAsia"/>
-        </w:rPr>
-        <w:t xml:space="preserve">90 </w:t>
-      </w:r>
-      <w:r>
-        <w:rPr>
-          <w:rFonts w:hint="eastAsia"/>
-        </w:rPr>
-        <w:t>分位对应的截断值为</w:t>
-      </w:r>
-      <w:r>
-        <w:rPr>
-          <w:rFonts w:hint="eastAsia"/>
-        </w:rPr>
-        <w:t xml:space="preserve"> 1.7014</w:t>
-      </w:r>
-      <w:r>
-        <w:rPr>
-          <w:rFonts w:hint="eastAsia"/>
-        </w:rPr>
-        <w:t>，该取值已经压到奖励分布的主体而不只是尾部，约一成窗口因此选中不同动作。据此把</w:t>
-      </w:r>
-      <w:r>
-        <w:rPr>
-          <w:rFonts w:hint="eastAsia"/>
-        </w:rPr>
-        <w:t xml:space="preserve"> 95 </w:t>
-      </w:r>
-      <w:r>
-        <w:rPr>
-          <w:rFonts w:hint="eastAsia"/>
-        </w:rPr>
-        <w:t>分位作为下界，更低的取值改变的不再是极端值而是分布本身。</w:t>
-      </w:r>
-    </w:p>
-    <w:p>
-      <w:pPr>
-        <w:ind w:firstLineChars="200" w:firstLine="420"/>
-      </w:pPr>
-      <w:r>
-        <w:rPr>
-          <w:rFonts w:hint="eastAsia"/>
-        </w:rPr>
-        <w:t>截断分位数的取值经过敏感性检验。</w:t>
-      </w:r>
-      <w:r>
-        <w:rPr>
-          <w:rFonts w:hint="eastAsia"/>
-        </w:rPr>
-        <w:t xml:space="preserve">95 </w:t>
-      </w:r>
-      <w:r>
-        <w:rPr>
-          <w:rFonts w:hint="eastAsia"/>
-        </w:rPr>
-        <w:t>分位这一取值是在观察奖励分布之后确定的，因此需要检验结论是否依赖它。取</w:t>
-      </w:r>
-      <w:r>
-        <w:rPr>
-          <w:rFonts w:hint="eastAsia"/>
-        </w:rPr>
-        <w:t xml:space="preserve"> 90 </w:t>
-      </w:r>
-      <w:r>
-        <w:rPr>
-          <w:rFonts w:hint="eastAsia"/>
-        </w:rPr>
-        <w:t>与</w:t>
-      </w:r>
-      <w:r>
-        <w:rPr>
-          <w:rFonts w:hint="eastAsia"/>
-        </w:rPr>
-        <w:t xml:space="preserve"> 95 </w:t>
-      </w:r>
-      <w:r>
-        <w:rPr>
-          <w:rFonts w:hint="eastAsia"/>
-        </w:rPr>
-        <w:t>与</w:t>
-      </w:r>
-      <w:r>
-        <w:rPr>
-          <w:rFonts w:hint="eastAsia"/>
-        </w:rPr>
-        <w:t xml:space="preserve"> 99 </w:t>
-      </w:r>
-      <w:r>
-        <w:rPr>
-          <w:rFonts w:hint="eastAsia"/>
-        </w:rPr>
-        <w:t>三档重建价值表并比较策略行为，三档对应的截断值分别为</w:t>
-      </w:r>
-      <w:r>
-        <w:rPr>
-          <w:rFonts w:hint="eastAsia"/>
-        </w:rPr>
-        <w:t xml:space="preserve"> 1.70 </w:t>
-      </w:r>
-      <w:r>
-        <w:rPr>
-          <w:rFonts w:hint="eastAsia"/>
-        </w:rPr>
-        <w:t>与</w:t>
-      </w:r>
-      <w:r>
-        <w:rPr>
-          <w:rFonts w:hint="eastAsia"/>
-        </w:rPr>
-        <w:t xml:space="preserve"> 5.89 </w:t>
-      </w:r>
-      <w:r>
-        <w:rPr>
-          <w:rFonts w:hint="eastAsia"/>
-        </w:rPr>
-        <w:t>与</w:t>
-      </w:r>
-      <w:r>
-        <w:rPr>
-          <w:rFonts w:hint="eastAsia"/>
-        </w:rPr>
-        <w:t xml:space="preserve"> 58.74</w:t>
-      </w:r>
-      <w:r>
-        <w:rPr>
-          <w:rFonts w:hint="eastAsia"/>
-        </w:rPr>
-        <w:t>，被截断的接受候选分别为</w:t>
-      </w:r>
-      <w:r>
-        <w:rPr>
-          <w:rFonts w:hint="eastAsia"/>
-        </w:rPr>
-        <w:t xml:space="preserve"> 404 </w:t>
-      </w:r>
-      <w:r>
-        <w:rPr>
-          <w:rFonts w:hint="eastAsia"/>
-        </w:rPr>
-        <w:t>次中的</w:t>
-      </w:r>
-      <w:r>
-        <w:rPr>
-          <w:rFonts w:hint="eastAsia"/>
-        </w:rPr>
-        <w:t xml:space="preserve"> 32 </w:t>
-      </w:r>
-      <w:r>
-        <w:rPr>
-          <w:rFonts w:hint="eastAsia"/>
-        </w:rPr>
-        <w:t>次与</w:t>
-      </w:r>
-      <w:r>
-        <w:rPr>
-          <w:rFonts w:hint="eastAsia"/>
-        </w:rPr>
-        <w:t xml:space="preserve"> 17 </w:t>
-      </w:r>
-      <w:r>
-        <w:rPr>
-          <w:rFonts w:hint="eastAsia"/>
-        </w:rPr>
-        <w:t>次与</w:t>
-      </w:r>
-      <w:r>
-        <w:rPr>
-          <w:rFonts w:hint="eastAsia"/>
-        </w:rPr>
-        <w:t xml:space="preserve"> 3 </w:t>
-      </w:r>
-      <w:r>
-        <w:rPr>
-          <w:rFonts w:hint="eastAsia"/>
-        </w:rPr>
-        <w:t>次。以上置信界在同一语料上选出的动作衡量，三档两两之间选中同一动作的窗口比例为</w:t>
-      </w:r>
-      <w:r>
-        <w:rPr>
-          <w:rFonts w:hint="eastAsia"/>
-        </w:rPr>
-        <w:t xml:space="preserve"> 0.8785 </w:t>
-      </w:r>
-      <w:r>
-        <w:rPr>
-          <w:rFonts w:hint="eastAsia"/>
-        </w:rPr>
-        <w:t>至</w:t>
-      </w:r>
-      <w:r>
-        <w:rPr>
-          <w:rFonts w:hint="eastAsia"/>
-        </w:rPr>
-        <w:t xml:space="preserve"> 0.9860</w:t>
-      </w:r>
-      <w:r>
-        <w:rPr>
-          <w:rFonts w:hint="eastAsia"/>
-        </w:rPr>
-        <w:t>，价值表全序的肯德尔相关系数为</w:t>
-      </w:r>
-      <w:r>
-        <w:rPr>
-          <w:rFonts w:hint="eastAsia"/>
-        </w:rPr>
-        <w:t xml:space="preserve"> 0.8796 </w:t>
-      </w:r>
-      <w:r>
-        <w:rPr>
-          <w:rFonts w:hint="eastAsia"/>
-        </w:rPr>
-        <w:t>至</w:t>
-      </w:r>
-      <w:r>
-        <w:rPr>
-          <w:rFonts w:hint="eastAsia"/>
-        </w:rPr>
-        <w:t xml:space="preserve"> 0.9759</w:t>
-      </w:r>
-      <w:r>
-        <w:rPr>
-          <w:rFonts w:hint="eastAsia"/>
-        </w:rPr>
-        <w:t>，其中</w:t>
-      </w:r>
-      <w:r>
-        <w:rPr>
-          <w:rFonts w:hint="eastAsia"/>
-        </w:rPr>
-        <w:t xml:space="preserve"> 95 </w:t>
-      </w:r>
-      <w:r>
-        <w:rPr>
-          <w:rFonts w:hint="eastAsia"/>
-        </w:rPr>
-        <w:t>与</w:t>
-      </w:r>
-      <w:r>
-        <w:rPr>
-          <w:rFonts w:hint="eastAsia"/>
-        </w:rPr>
-        <w:t xml:space="preserve"> 99 </w:t>
-      </w:r>
-      <w:r>
-        <w:rPr>
-          <w:rFonts w:hint="eastAsia"/>
-        </w:rPr>
-        <w:t>两档的一致比例达</w:t>
-      </w:r>
-      <w:r>
-        <w:rPr>
-          <w:rFonts w:hint="eastAsia"/>
-        </w:rPr>
-        <w:t xml:space="preserve"> 0.9860</w:t>
-      </w:r>
-      <w:r>
-        <w:rPr>
-          <w:rFonts w:hint="eastAsia"/>
-        </w:rPr>
-        <w:t>。结论不依赖该取值。</w:t>
-      </w:r>
-      <w:r>
-        <w:rPr>
-          <w:rFonts w:hint="eastAsia"/>
-        </w:rPr>
-        <w:t xml:space="preserve">90 </w:t>
-      </w:r>
-      <w:r>
-        <w:rPr>
-          <w:rFonts w:hint="eastAsia"/>
-        </w:rPr>
-        <w:t>分位与另两档的差距略大，约一成窗口选中不同动作，原因是该档把</w:t>
-      </w:r>
-      <w:r>
-        <w:rPr>
-          <w:rFonts w:hint="eastAsia"/>
-        </w:rPr>
-        <w:t xml:space="preserve"> 32 </w:t>
-      </w:r>
-      <w:r>
-        <w:rPr>
-          <w:rFonts w:hint="eastAsia"/>
-        </w:rPr>
-        <w:t>次接受压到</w:t>
-      </w:r>
-      <w:r>
-        <w:rPr>
-          <w:rFonts w:hint="eastAsia"/>
-        </w:rPr>
-        <w:t xml:space="preserve"> 1.70</w:t>
-      </w:r>
-      <w:r>
-        <w:rPr>
-          <w:rFonts w:hint="eastAsia"/>
-        </w:rPr>
-        <w:t>，压缩幅度已经触及分布主体。</w:t>
+        <w:t xml:space="preserve">截断分位数的取值经过敏感性检验，取值本身是在观察奖励分布之后确定的，因此需要检验结论是否依赖它。取 90 与 95 与 99 三档重建价值表并比较策略在同一语料上选出的动作，三档对应的截断值分别为 1.7014 与 5.8867 与 58.7369，被截断的接受候选分别为 404 次中的 32 次与 17 次与 3 次。以上置信界选出的动作衡量，三档两两之间选中同一动作的窗口比例为 0.8785 至 0.9860，价值表全序的肯德尔相关系数为 0.8796 至 0.9759，其中 95 与 99 两档的一致比例达 0.9860。结论不依赖该取值。90 分位与另两档的差距略大，约一成窗口选中不同动作，原因是该档把 32 次接受压到 1.7014，压缩幅度已经触及分布主体而不只是尾部，据此把 95 分位作为下界，更低的取值改变的不再是极端值而是分布本身。</w:t>
       </w:r>
     </w:p>
     <w:p>

</xml_diff>